<commit_message>
Shorter UAT, like the Tyler plan: one test per check and the System Checks
Administrator 53 tests (from 203), Cashier 21 (from 84), Supplier 20 (from
65): the most telling test of each check in each module, plus the System
Check tests; each written as one sentence. Each role's UAT signs in as that
role.

Co-Authored-By: Claude Opus 5.5 <noreply@anthropic.com>
</commit_message>
<xml_diff>
--- a/QA/FETCH-UAT-Supplier.docx
+++ b/QA/FETCH-UAT-Supplier.docx
@@ -697,106 +697,7 @@
                 <w:rFonts w:ascii="Calibri" w:hAnsi="Calibri"/>
                 <w:sz w:val="21"/>
               </w:rPr>
-              <w:t>Check if a valid sign in works</w:t>
-            </w:r>
-          </w:p>
-          <w:p>
-            <w:pPr>
-              <w:spacing w:after="0"/>
-            </w:pPr>
-            <w:r>
-              <w:rPr>
-                <w:rFonts w:ascii="Calibri" w:hAnsi="Calibri"/>
-                <w:sz w:val="21"/>
-              </w:rPr>
-              <w:t>Enter the username and the password, then click Sign in</w:t>
-            </w:r>
-          </w:p>
-        </w:tc>
-        <w:tc>
-          <w:tcPr>
-            <w:tcW w:type="dxa" w:w="4700"/>
-          </w:tcPr>
-          <w:p>
-            <w:pPr>
-              <w:spacing w:after="0"/>
-            </w:pPr>
-            <w:r/>
-            <w:r>
-              <w:rPr>
-                <w:rFonts w:ascii="Calibri" w:hAnsi="Calibri"/>
-                <w:sz w:val="21"/>
-              </w:rPr>
-              <w:t>The user is signed in and taken to the home page of the account</w:t>
-            </w:r>
-          </w:p>
-        </w:tc>
-        <w:tc>
-          <w:tcPr>
-            <w:tcW w:type="dxa" w:w="2100"/>
-          </w:tcPr>
-          <w:p/>
-        </w:tc>
-        <w:tc>
-          <w:tcPr>
-            <w:tcW w:type="dxa" w:w="1520"/>
-          </w:tcPr>
-          <w:p/>
-        </w:tc>
-        <w:tc>
-          <w:tcPr>
-            <w:tcW w:type="dxa" w:w="1100"/>
-          </w:tcPr>
-          <w:p/>
-        </w:tc>
-      </w:tr>
-      <w:tr>
-        <w:tc>
-          <w:tcPr>
-            <w:tcW w:type="dxa" w:w="1900"/>
-            <w:vMerge/>
-          </w:tcPr>
-          <w:p/>
-        </w:tc>
-        <w:tc>
-          <w:tcPr>
-            <w:tcW w:type="dxa" w:w="600"/>
-          </w:tcPr>
-          <w:p/>
-        </w:tc>
-        <w:tc>
-          <w:tcPr>
-            <w:tcW w:type="dxa" w:w="2300"/>
-          </w:tcPr>
-          <w:p/>
-        </w:tc>
-        <w:tc>
-          <w:tcPr>
-            <w:tcW w:type="dxa" w:w="4500"/>
-          </w:tcPr>
-          <w:p>
-            <w:pPr>
-              <w:spacing w:after="0"/>
-            </w:pPr>
-            <w:r/>
-            <w:r>
-              <w:rPr>
-                <w:rFonts w:ascii="Calibri" w:hAnsi="Calibri"/>
-                <w:sz w:val="21"/>
-              </w:rPr>
-              <w:t>Check if Username is empty</w:t>
-            </w:r>
-          </w:p>
-          <w:p>
-            <w:pPr>
-              <w:spacing w:after="0"/>
-            </w:pPr>
-            <w:r>
-              <w:rPr>
-                <w:rFonts w:ascii="Calibri" w:hAnsi="Calibri"/>
-                <w:sz w:val="21"/>
-              </w:rPr>
-              <w:t>Leave Username empty, then click Sign in</w:t>
+              <w:t>Check if Username is empty: leave Username empty, then click Sign in</w:t>
             </w:r>
           </w:p>
         </w:tc>
@@ -815,354 +716,6 @@
                 <w:sz w:val="21"/>
               </w:rPr>
               <w:t>A tooltip "Please fill out this field." is displayed on Username</w:t>
-            </w:r>
-          </w:p>
-        </w:tc>
-        <w:tc>
-          <w:tcPr>
-            <w:tcW w:type="dxa" w:w="2100"/>
-          </w:tcPr>
-          <w:p/>
-        </w:tc>
-        <w:tc>
-          <w:tcPr>
-            <w:tcW w:type="dxa" w:w="1520"/>
-          </w:tcPr>
-          <w:p/>
-        </w:tc>
-        <w:tc>
-          <w:tcPr>
-            <w:tcW w:type="dxa" w:w="1100"/>
-          </w:tcPr>
-          <w:p/>
-        </w:tc>
-      </w:tr>
-      <w:tr>
-        <w:tc>
-          <w:tcPr>
-            <w:tcW w:type="dxa" w:w="1900"/>
-            <w:vMerge/>
-          </w:tcPr>
-          <w:p/>
-        </w:tc>
-        <w:tc>
-          <w:tcPr>
-            <w:tcW w:type="dxa" w:w="600"/>
-          </w:tcPr>
-          <w:p/>
-        </w:tc>
-        <w:tc>
-          <w:tcPr>
-            <w:tcW w:type="dxa" w:w="2300"/>
-          </w:tcPr>
-          <w:p/>
-        </w:tc>
-        <w:tc>
-          <w:tcPr>
-            <w:tcW w:type="dxa" w:w="4500"/>
-          </w:tcPr>
-          <w:p>
-            <w:pPr>
-              <w:spacing w:after="0"/>
-            </w:pPr>
-            <w:r/>
-            <w:r>
-              <w:rPr>
-                <w:rFonts w:ascii="Calibri" w:hAnsi="Calibri"/>
-                <w:sz w:val="21"/>
-              </w:rPr>
-              <w:t>Check if Password is empty</w:t>
-            </w:r>
-          </w:p>
-          <w:p>
-            <w:pPr>
-              <w:spacing w:after="0"/>
-            </w:pPr>
-            <w:r>
-              <w:rPr>
-                <w:rFonts w:ascii="Calibri" w:hAnsi="Calibri"/>
-                <w:sz w:val="21"/>
-              </w:rPr>
-              <w:t>Leave Password empty, then click Sign in</w:t>
-            </w:r>
-          </w:p>
-        </w:tc>
-        <w:tc>
-          <w:tcPr>
-            <w:tcW w:type="dxa" w:w="4700"/>
-          </w:tcPr>
-          <w:p>
-            <w:pPr>
-              <w:spacing w:after="0"/>
-            </w:pPr>
-            <w:r/>
-            <w:r>
-              <w:rPr>
-                <w:rFonts w:ascii="Calibri" w:hAnsi="Calibri"/>
-                <w:sz w:val="21"/>
-              </w:rPr>
-              <w:t>A tooltip "Please fill out this field." is displayed on Password</w:t>
-            </w:r>
-          </w:p>
-        </w:tc>
-        <w:tc>
-          <w:tcPr>
-            <w:tcW w:type="dxa" w:w="2100"/>
-          </w:tcPr>
-          <w:p/>
-        </w:tc>
-        <w:tc>
-          <w:tcPr>
-            <w:tcW w:type="dxa" w:w="1520"/>
-          </w:tcPr>
-          <w:p/>
-        </w:tc>
-        <w:tc>
-          <w:tcPr>
-            <w:tcW w:type="dxa" w:w="1100"/>
-          </w:tcPr>
-          <w:p/>
-        </w:tc>
-      </w:tr>
-      <w:tr>
-        <w:tc>
-          <w:tcPr>
-            <w:tcW w:type="dxa" w:w="1900"/>
-            <w:vMerge/>
-          </w:tcPr>
-          <w:p/>
-        </w:tc>
-        <w:tc>
-          <w:tcPr>
-            <w:tcW w:type="dxa" w:w="600"/>
-          </w:tcPr>
-          <w:p/>
-        </w:tc>
-        <w:tc>
-          <w:tcPr>
-            <w:tcW w:type="dxa" w:w="2300"/>
-          </w:tcPr>
-          <w:p/>
-        </w:tc>
-        <w:tc>
-          <w:tcPr>
-            <w:tcW w:type="dxa" w:w="4500"/>
-          </w:tcPr>
-          <w:p>
-            <w:pPr>
-              <w:spacing w:after="0"/>
-            </w:pPr>
-            <w:r/>
-            <w:r>
-              <w:rPr>
-                <w:rFonts w:ascii="Calibri" w:hAnsi="Calibri"/>
-                <w:sz w:val="21"/>
-              </w:rPr>
-              <w:t>Check if the reset username or email is empty</w:t>
-            </w:r>
-          </w:p>
-          <w:p>
-            <w:pPr>
-              <w:spacing w:after="0"/>
-            </w:pPr>
-            <w:r>
-              <w:rPr>
-                <w:rFonts w:ascii="Calibri" w:hAnsi="Calibri"/>
-                <w:sz w:val="21"/>
-              </w:rPr>
-              <w:t>Type the username, click "Forgot your password?", clear the Username or email box, then click Ask for a reset</w:t>
-            </w:r>
-          </w:p>
-        </w:tc>
-        <w:tc>
-          <w:tcPr>
-            <w:tcW w:type="dxa" w:w="4700"/>
-          </w:tcPr>
-          <w:p>
-            <w:pPr>
-              <w:spacing w:after="0"/>
-            </w:pPr>
-            <w:r/>
-            <w:r>
-              <w:rPr>
-                <w:rFonts w:ascii="Calibri" w:hAnsi="Calibri"/>
-                <w:sz w:val="21"/>
-              </w:rPr>
-              <w:t>A tooltip "Please fill out this field." is displayed</w:t>
-            </w:r>
-          </w:p>
-        </w:tc>
-        <w:tc>
-          <w:tcPr>
-            <w:tcW w:type="dxa" w:w="2100"/>
-          </w:tcPr>
-          <w:p/>
-        </w:tc>
-        <w:tc>
-          <w:tcPr>
-            <w:tcW w:type="dxa" w:w="1520"/>
-          </w:tcPr>
-          <w:p/>
-        </w:tc>
-        <w:tc>
-          <w:tcPr>
-            <w:tcW w:type="dxa" w:w="1100"/>
-          </w:tcPr>
-          <w:p/>
-        </w:tc>
-      </w:tr>
-      <w:tr>
-        <w:tc>
-          <w:tcPr>
-            <w:tcW w:type="dxa" w:w="1900"/>
-            <w:vMerge/>
-          </w:tcPr>
-          <w:p/>
-        </w:tc>
-        <w:tc>
-          <w:tcPr>
-            <w:tcW w:type="dxa" w:w="600"/>
-          </w:tcPr>
-          <w:p/>
-        </w:tc>
-        <w:tc>
-          <w:tcPr>
-            <w:tcW w:type="dxa" w:w="2300"/>
-          </w:tcPr>
-          <w:p/>
-        </w:tc>
-        <w:tc>
-          <w:tcPr>
-            <w:tcW w:type="dxa" w:w="4500"/>
-          </w:tcPr>
-          <w:p>
-            <w:pPr>
-              <w:spacing w:after="0"/>
-            </w:pPr>
-            <w:r/>
-            <w:r>
-              <w:rPr>
-                <w:rFonts w:ascii="Calibri" w:hAnsi="Calibri"/>
-                <w:sz w:val="21"/>
-              </w:rPr>
-              <w:t>Check if New password is empty</w:t>
-            </w:r>
-          </w:p>
-          <w:p>
-            <w:pPr>
-              <w:spacing w:after="0"/>
-            </w:pPr>
-            <w:r>
-              <w:rPr>
-                <w:rFonts w:ascii="Calibri" w:hAnsi="Calibri"/>
-                <w:sz w:val="21"/>
-              </w:rPr>
-              <w:t>Open a reset link, leave New password empty, then click Save new password</w:t>
-            </w:r>
-          </w:p>
-        </w:tc>
-        <w:tc>
-          <w:tcPr>
-            <w:tcW w:type="dxa" w:w="4700"/>
-          </w:tcPr>
-          <w:p>
-            <w:pPr>
-              <w:spacing w:after="0"/>
-            </w:pPr>
-            <w:r/>
-            <w:r>
-              <w:rPr>
-                <w:rFonts w:ascii="Calibri" w:hAnsi="Calibri"/>
-                <w:sz w:val="21"/>
-              </w:rPr>
-              <w:t>A tooltip "Please fill out this field." is displayed</w:t>
-            </w:r>
-          </w:p>
-        </w:tc>
-        <w:tc>
-          <w:tcPr>
-            <w:tcW w:type="dxa" w:w="2100"/>
-          </w:tcPr>
-          <w:p/>
-        </w:tc>
-        <w:tc>
-          <w:tcPr>
-            <w:tcW w:type="dxa" w:w="1520"/>
-          </w:tcPr>
-          <w:p/>
-        </w:tc>
-        <w:tc>
-          <w:tcPr>
-            <w:tcW w:type="dxa" w:w="1100"/>
-          </w:tcPr>
-          <w:p/>
-        </w:tc>
-      </w:tr>
-      <w:tr>
-        <w:tc>
-          <w:tcPr>
-            <w:tcW w:type="dxa" w:w="1900"/>
-            <w:vMerge/>
-          </w:tcPr>
-          <w:p/>
-        </w:tc>
-        <w:tc>
-          <w:tcPr>
-            <w:tcW w:type="dxa" w:w="600"/>
-          </w:tcPr>
-          <w:p/>
-        </w:tc>
-        <w:tc>
-          <w:tcPr>
-            <w:tcW w:type="dxa" w:w="2300"/>
-          </w:tcPr>
-          <w:p/>
-        </w:tc>
-        <w:tc>
-          <w:tcPr>
-            <w:tcW w:type="dxa" w:w="4500"/>
-          </w:tcPr>
-          <w:p>
-            <w:pPr>
-              <w:spacing w:after="0"/>
-            </w:pPr>
-            <w:r/>
-            <w:r>
-              <w:rPr>
-                <w:rFonts w:ascii="Calibri" w:hAnsi="Calibri"/>
-                <w:sz w:val="21"/>
-              </w:rPr>
-              <w:t>Check if a username is needed for a reset</w:t>
-            </w:r>
-          </w:p>
-          <w:p>
-            <w:pPr>
-              <w:spacing w:after="0"/>
-            </w:pPr>
-            <w:r>
-              <w:rPr>
-                <w:rFonts w:ascii="Calibri" w:hAnsi="Calibri"/>
-                <w:sz w:val="21"/>
-              </w:rPr>
-              <w:t>Leave Username empty, then click "Forgot your password?"</w:t>
-            </w:r>
-          </w:p>
-        </w:tc>
-        <w:tc>
-          <w:tcPr>
-            <w:tcW w:type="dxa" w:w="4700"/>
-          </w:tcPr>
-          <w:p>
-            <w:pPr>
-              <w:spacing w:after="0"/>
-            </w:pPr>
-            <w:r/>
-            <w:r>
-              <w:rPr>
-                <w:rFonts w:ascii="Calibri" w:hAnsi="Calibri"/>
-                <w:sz w:val="21"/>
-              </w:rPr>
-              <w:t>A message "Enter your username first." is displayed and the reset box does not open</w:t>
             </w:r>
           </w:p>
         </w:tc>
@@ -1302,280 +855,7 @@
                 <w:rFonts w:ascii="Calibri" w:hAnsi="Calibri"/>
                 <w:sz w:val="21"/>
               </w:rPr>
-              <w:t>Check if a password with every kind of character is accepted</w:t>
-            </w:r>
-          </w:p>
-          <w:p>
-            <w:pPr>
-              <w:spacing w:after="0"/>
-            </w:pPr>
-            <w:r>
-              <w:rPr>
-                <w:rFonts w:ascii="Calibri" w:hAnsi="Calibri"/>
-                <w:sz w:val="21"/>
-              </w:rPr>
-              <w:t>Open a reset link, enter a new password with an uppercase letter, a lowercase letter, a number and a special character, then click Save new password</w:t>
-            </w:r>
-          </w:p>
-        </w:tc>
-        <w:tc>
-          <w:tcPr>
-            <w:tcW w:type="dxa" w:w="4700"/>
-          </w:tcPr>
-          <w:p>
-            <w:pPr>
-              <w:spacing w:after="0"/>
-            </w:pPr>
-            <w:r/>
-            <w:r>
-              <w:rPr>
-                <w:rFonts w:ascii="Calibri" w:hAnsi="Calibri"/>
-                <w:sz w:val="21"/>
-              </w:rPr>
-              <w:t>A message "Password has been reset. You can now sign in. Redirecting to sign in..." is displayed</w:t>
-            </w:r>
-          </w:p>
-        </w:tc>
-        <w:tc>
-          <w:tcPr>
-            <w:tcW w:type="dxa" w:w="2100"/>
-          </w:tcPr>
-          <w:p/>
-        </w:tc>
-        <w:tc>
-          <w:tcPr>
-            <w:tcW w:type="dxa" w:w="1520"/>
-          </w:tcPr>
-          <w:p/>
-        </w:tc>
-        <w:tc>
-          <w:tcPr>
-            <w:tcW w:type="dxa" w:w="1100"/>
-          </w:tcPr>
-          <w:p/>
-        </w:tc>
-      </w:tr>
-      <w:tr>
-        <w:tc>
-          <w:tcPr>
-            <w:tcW w:type="dxa" w:w="1900"/>
-            <w:vMerge/>
-          </w:tcPr>
-          <w:p/>
-        </w:tc>
-        <w:tc>
-          <w:tcPr>
-            <w:tcW w:type="dxa" w:w="600"/>
-          </w:tcPr>
-          <w:p/>
-        </w:tc>
-        <w:tc>
-          <w:tcPr>
-            <w:tcW w:type="dxa" w:w="2300"/>
-          </w:tcPr>
-          <w:p/>
-        </w:tc>
-        <w:tc>
-          <w:tcPr>
-            <w:tcW w:type="dxa" w:w="4500"/>
-          </w:tcPr>
-          <w:p>
-            <w:pPr>
-              <w:spacing w:after="0"/>
-            </w:pPr>
-            <w:r/>
-            <w:r>
-              <w:rPr>
-                <w:rFonts w:ascii="Calibri" w:hAnsi="Calibri"/>
-                <w:sz w:val="21"/>
-              </w:rPr>
-              <w:t>Check if the password has no uppercase letter</w:t>
-            </w:r>
-          </w:p>
-          <w:p>
-            <w:pPr>
-              <w:spacing w:after="0"/>
-            </w:pPr>
-            <w:r>
-              <w:rPr>
-                <w:rFonts w:ascii="Calibri" w:hAnsi="Calibri"/>
-                <w:sz w:val="21"/>
-              </w:rPr>
-              <w:t>Enter a new password without an uppercase letter</w:t>
-            </w:r>
-          </w:p>
-        </w:tc>
-        <w:tc>
-          <w:tcPr>
-            <w:tcW w:type="dxa" w:w="4700"/>
-          </w:tcPr>
-          <w:p>
-            <w:pPr>
-              <w:spacing w:after="0"/>
-            </w:pPr>
-            <w:r/>
-            <w:r>
-              <w:rPr>
-                <w:rFonts w:ascii="Calibri" w:hAnsi="Calibri"/>
-                <w:sz w:val="21"/>
-              </w:rPr>
-              <w:t>A message "Password must contain at least one uppercase letter (A–Z)" is displayed</w:t>
-            </w:r>
-          </w:p>
-        </w:tc>
-        <w:tc>
-          <w:tcPr>
-            <w:tcW w:type="dxa" w:w="2100"/>
-          </w:tcPr>
-          <w:p/>
-        </w:tc>
-        <w:tc>
-          <w:tcPr>
-            <w:tcW w:type="dxa" w:w="1520"/>
-          </w:tcPr>
-          <w:p/>
-        </w:tc>
-        <w:tc>
-          <w:tcPr>
-            <w:tcW w:type="dxa" w:w="1100"/>
-          </w:tcPr>
-          <w:p/>
-        </w:tc>
-      </w:tr>
-      <w:tr>
-        <w:tc>
-          <w:tcPr>
-            <w:tcW w:type="dxa" w:w="1900"/>
-            <w:vMerge/>
-          </w:tcPr>
-          <w:p/>
-        </w:tc>
-        <w:tc>
-          <w:tcPr>
-            <w:tcW w:type="dxa" w:w="600"/>
-          </w:tcPr>
-          <w:p/>
-        </w:tc>
-        <w:tc>
-          <w:tcPr>
-            <w:tcW w:type="dxa" w:w="2300"/>
-          </w:tcPr>
-          <w:p/>
-        </w:tc>
-        <w:tc>
-          <w:tcPr>
-            <w:tcW w:type="dxa" w:w="4500"/>
-          </w:tcPr>
-          <w:p>
-            <w:pPr>
-              <w:spacing w:after="0"/>
-            </w:pPr>
-            <w:r/>
-            <w:r>
-              <w:rPr>
-                <w:rFonts w:ascii="Calibri" w:hAnsi="Calibri"/>
-                <w:sz w:val="21"/>
-              </w:rPr>
-              <w:t>Check if the password has no lowercase letter</w:t>
-            </w:r>
-          </w:p>
-          <w:p>
-            <w:pPr>
-              <w:spacing w:after="0"/>
-            </w:pPr>
-            <w:r>
-              <w:rPr>
-                <w:rFonts w:ascii="Calibri" w:hAnsi="Calibri"/>
-                <w:sz w:val="21"/>
-              </w:rPr>
-              <w:t>Enter a new password without a lowercase letter</w:t>
-            </w:r>
-          </w:p>
-        </w:tc>
-        <w:tc>
-          <w:tcPr>
-            <w:tcW w:type="dxa" w:w="4700"/>
-          </w:tcPr>
-          <w:p>
-            <w:pPr>
-              <w:spacing w:after="0"/>
-            </w:pPr>
-            <w:r/>
-            <w:r>
-              <w:rPr>
-                <w:rFonts w:ascii="Calibri" w:hAnsi="Calibri"/>
-                <w:sz w:val="21"/>
-              </w:rPr>
-              <w:t>A message "Password must contain at least one lowercase letter (a–z)" is displayed</w:t>
-            </w:r>
-          </w:p>
-        </w:tc>
-        <w:tc>
-          <w:tcPr>
-            <w:tcW w:type="dxa" w:w="2100"/>
-          </w:tcPr>
-          <w:p/>
-        </w:tc>
-        <w:tc>
-          <w:tcPr>
-            <w:tcW w:type="dxa" w:w="1520"/>
-          </w:tcPr>
-          <w:p/>
-        </w:tc>
-        <w:tc>
-          <w:tcPr>
-            <w:tcW w:type="dxa" w:w="1100"/>
-          </w:tcPr>
-          <w:p/>
-        </w:tc>
-      </w:tr>
-      <w:tr>
-        <w:tc>
-          <w:tcPr>
-            <w:tcW w:type="dxa" w:w="1900"/>
-            <w:vMerge/>
-          </w:tcPr>
-          <w:p/>
-        </w:tc>
-        <w:tc>
-          <w:tcPr>
-            <w:tcW w:type="dxa" w:w="600"/>
-          </w:tcPr>
-          <w:p/>
-        </w:tc>
-        <w:tc>
-          <w:tcPr>
-            <w:tcW w:type="dxa" w:w="2300"/>
-          </w:tcPr>
-          <w:p/>
-        </w:tc>
-        <w:tc>
-          <w:tcPr>
-            <w:tcW w:type="dxa" w:w="4500"/>
-          </w:tcPr>
-          <w:p>
-            <w:pPr>
-              <w:spacing w:after="0"/>
-            </w:pPr>
-            <w:r/>
-            <w:r>
-              <w:rPr>
-                <w:rFonts w:ascii="Calibri" w:hAnsi="Calibri"/>
-                <w:sz w:val="21"/>
-              </w:rPr>
-              <w:t>Check if the password has no number</w:t>
-            </w:r>
-          </w:p>
-          <w:p>
-            <w:pPr>
-              <w:spacing w:after="0"/>
-            </w:pPr>
-            <w:r>
-              <w:rPr>
-                <w:rFonts w:ascii="Calibri" w:hAnsi="Calibri"/>
-                <w:sz w:val="21"/>
-              </w:rPr>
-              <w:t>Enter a new password without a number</w:t>
+              <w:t>Check if the password has no number: enter a new password without a number</w:t>
             </w:r>
           </w:p>
         </w:tc>
@@ -1594,93 +874,6 @@
                 <w:sz w:val="21"/>
               </w:rPr>
               <w:t>A message "Password must contain at least one number (0–9)" is displayed</w:t>
-            </w:r>
-          </w:p>
-        </w:tc>
-        <w:tc>
-          <w:tcPr>
-            <w:tcW w:type="dxa" w:w="2100"/>
-          </w:tcPr>
-          <w:p/>
-        </w:tc>
-        <w:tc>
-          <w:tcPr>
-            <w:tcW w:type="dxa" w:w="1520"/>
-          </w:tcPr>
-          <w:p/>
-        </w:tc>
-        <w:tc>
-          <w:tcPr>
-            <w:tcW w:type="dxa" w:w="1100"/>
-          </w:tcPr>
-          <w:p/>
-        </w:tc>
-      </w:tr>
-      <w:tr>
-        <w:tc>
-          <w:tcPr>
-            <w:tcW w:type="dxa" w:w="1900"/>
-            <w:vMerge/>
-          </w:tcPr>
-          <w:p/>
-        </w:tc>
-        <w:tc>
-          <w:tcPr>
-            <w:tcW w:type="dxa" w:w="600"/>
-          </w:tcPr>
-          <w:p/>
-        </w:tc>
-        <w:tc>
-          <w:tcPr>
-            <w:tcW w:type="dxa" w:w="2300"/>
-          </w:tcPr>
-          <w:p/>
-        </w:tc>
-        <w:tc>
-          <w:tcPr>
-            <w:tcW w:type="dxa" w:w="4500"/>
-          </w:tcPr>
-          <w:p>
-            <w:pPr>
-              <w:spacing w:after="0"/>
-            </w:pPr>
-            <w:r/>
-            <w:r>
-              <w:rPr>
-                <w:rFonts w:ascii="Calibri" w:hAnsi="Calibri"/>
-                <w:sz w:val="21"/>
-              </w:rPr>
-              <w:t>Check if the password has no special character</w:t>
-            </w:r>
-          </w:p>
-          <w:p>
-            <w:pPr>
-              <w:spacing w:after="0"/>
-            </w:pPr>
-            <w:r>
-              <w:rPr>
-                <w:rFonts w:ascii="Calibri" w:hAnsi="Calibri"/>
-                <w:sz w:val="21"/>
-              </w:rPr>
-              <w:t>Enter a new password without a special character</w:t>
-            </w:r>
-          </w:p>
-        </w:tc>
-        <w:tc>
-          <w:tcPr>
-            <w:tcW w:type="dxa" w:w="4700"/>
-          </w:tcPr>
-          <w:p>
-            <w:pPr>
-              <w:spacing w:after="0"/>
-            </w:pPr>
-            <w:r/>
-            <w:r>
-              <w:rPr>
-                <w:rFonts w:ascii="Calibri" w:hAnsi="Calibri"/>
-                <w:sz w:val="21"/>
-              </w:rPr>
-              <w:t>A message "Password must contain at least one special character (e.g. !@#$%)" is displayed</w:t>
             </w:r>
           </w:p>
         </w:tc>
@@ -1820,193 +1013,7 @@
                 <w:rFonts w:ascii="Calibri" w:hAnsi="Calibri"/>
                 <w:sz w:val="21"/>
               </w:rPr>
-              <w:t>Check if a password of 6 or more characters is saved</w:t>
-            </w:r>
-          </w:p>
-          <w:p>
-            <w:pPr>
-              <w:spacing w:after="0"/>
-            </w:pPr>
-            <w:r>
-              <w:rPr>
-                <w:rFonts w:ascii="Calibri" w:hAnsi="Calibri"/>
-                <w:sz w:val="21"/>
-              </w:rPr>
-              <w:t>Enter a new password of 6 characters or more that follows the rules, then click Save new password</w:t>
-            </w:r>
-          </w:p>
-        </w:tc>
-        <w:tc>
-          <w:tcPr>
-            <w:tcW w:type="dxa" w:w="4700"/>
-          </w:tcPr>
-          <w:p>
-            <w:pPr>
-              <w:spacing w:after="0"/>
-            </w:pPr>
-            <w:r/>
-            <w:r>
-              <w:rPr>
-                <w:rFonts w:ascii="Calibri" w:hAnsi="Calibri"/>
-                <w:sz w:val="21"/>
-              </w:rPr>
-              <w:t>The password is saved and the user is taken to the Sign in page</w:t>
-            </w:r>
-          </w:p>
-        </w:tc>
-        <w:tc>
-          <w:tcPr>
-            <w:tcW w:type="dxa" w:w="2100"/>
-          </w:tcPr>
-          <w:p/>
-        </w:tc>
-        <w:tc>
-          <w:tcPr>
-            <w:tcW w:type="dxa" w:w="1520"/>
-          </w:tcPr>
-          <w:p/>
-        </w:tc>
-        <w:tc>
-          <w:tcPr>
-            <w:tcW w:type="dxa" w:w="1100"/>
-          </w:tcPr>
-          <w:p/>
-        </w:tc>
-      </w:tr>
-      <w:tr>
-        <w:tc>
-          <w:tcPr>
-            <w:tcW w:type="dxa" w:w="1900"/>
-            <w:vMerge/>
-          </w:tcPr>
-          <w:p/>
-        </w:tc>
-        <w:tc>
-          <w:tcPr>
-            <w:tcW w:type="dxa" w:w="600"/>
-          </w:tcPr>
-          <w:p/>
-        </w:tc>
-        <w:tc>
-          <w:tcPr>
-            <w:tcW w:type="dxa" w:w="2300"/>
-          </w:tcPr>
-          <w:p/>
-        </w:tc>
-        <w:tc>
-          <w:tcPr>
-            <w:tcW w:type="dxa" w:w="4500"/>
-          </w:tcPr>
-          <w:p>
-            <w:pPr>
-              <w:spacing w:after="0"/>
-            </w:pPr>
-            <w:r/>
-            <w:r>
-              <w:rPr>
-                <w:rFonts w:ascii="Calibri" w:hAnsi="Calibri"/>
-                <w:sz w:val="21"/>
-              </w:rPr>
-              <w:t>Check if the password is shorter than 6 characters</w:t>
-            </w:r>
-          </w:p>
-          <w:p>
-            <w:pPr>
-              <w:spacing w:after="0"/>
-            </w:pPr>
-            <w:r>
-              <w:rPr>
-                <w:rFonts w:ascii="Calibri" w:hAnsi="Calibri"/>
-                <w:sz w:val="21"/>
-              </w:rPr>
-              <w:t>Enter a new password with fewer than 6 characters</w:t>
-            </w:r>
-          </w:p>
-        </w:tc>
-        <w:tc>
-          <w:tcPr>
-            <w:tcW w:type="dxa" w:w="4700"/>
-          </w:tcPr>
-          <w:p>
-            <w:pPr>
-              <w:spacing w:after="0"/>
-            </w:pPr>
-            <w:r/>
-            <w:r>
-              <w:rPr>
-                <w:rFonts w:ascii="Calibri" w:hAnsi="Calibri"/>
-                <w:sz w:val="21"/>
-              </w:rPr>
-              <w:t>A message "Password must be at least 6 characters long" is displayed</w:t>
-            </w:r>
-          </w:p>
-        </w:tc>
-        <w:tc>
-          <w:tcPr>
-            <w:tcW w:type="dxa" w:w="2100"/>
-          </w:tcPr>
-          <w:p/>
-        </w:tc>
-        <w:tc>
-          <w:tcPr>
-            <w:tcW w:type="dxa" w:w="1520"/>
-          </w:tcPr>
-          <w:p/>
-        </w:tc>
-        <w:tc>
-          <w:tcPr>
-            <w:tcW w:type="dxa" w:w="1100"/>
-          </w:tcPr>
-          <w:p/>
-        </w:tc>
-      </w:tr>
-      <w:tr>
-        <w:tc>
-          <w:tcPr>
-            <w:tcW w:type="dxa" w:w="1900"/>
-            <w:vMerge/>
-          </w:tcPr>
-          <w:p/>
-        </w:tc>
-        <w:tc>
-          <w:tcPr>
-            <w:tcW w:type="dxa" w:w="600"/>
-          </w:tcPr>
-          <w:p/>
-        </w:tc>
-        <w:tc>
-          <w:tcPr>
-            <w:tcW w:type="dxa" w:w="2300"/>
-          </w:tcPr>
-          <w:p/>
-        </w:tc>
-        <w:tc>
-          <w:tcPr>
-            <w:tcW w:type="dxa" w:w="4500"/>
-          </w:tcPr>
-          <w:p>
-            <w:pPr>
-              <w:spacing w:after="0"/>
-            </w:pPr>
-            <w:r/>
-            <w:r>
-              <w:rPr>
-                <w:rFonts w:ascii="Calibri" w:hAnsi="Calibri"/>
-                <w:sz w:val="21"/>
-              </w:rPr>
-              <w:t>Check if a 6th wrong sign-in is blocked</w:t>
-            </w:r>
-          </w:p>
-          <w:p>
-            <w:pPr>
-              <w:spacing w:after="0"/>
-            </w:pPr>
-            <w:r>
-              <w:rPr>
-                <w:rFonts w:ascii="Calibri" w:hAnsi="Calibri"/>
-                <w:sz w:val="21"/>
-              </w:rPr>
-              <w:t>Enter a wrong password 5 times within 15 minutes, then try a 6th time</w:t>
+              <w:t>Check if a 6th wrong sign-in is blocked: enter a wrong password 5 times within 15 minutes, then try a 6th time</w:t>
             </w:r>
           </w:p>
         </w:tc>
@@ -2164,19 +1171,7 @@
                 <w:rFonts w:ascii="Calibri" w:hAnsi="Calibri"/>
                 <w:sz w:val="21"/>
               </w:rPr>
-              <w:t>Check if the two passwords do not match</w:t>
-            </w:r>
-          </w:p>
-          <w:p>
-            <w:pPr>
-              <w:spacing w:after="0"/>
-            </w:pPr>
-            <w:r>
-              <w:rPr>
-                <w:rFonts w:ascii="Calibri" w:hAnsi="Calibri"/>
-                <w:sz w:val="21"/>
-              </w:rPr>
-              <w:t>Open a reset link, enter a new password and a different password in Confirm password, then click Save new password</w:t>
+              <w:t>Check if the two passwords do not match: open a reset link, enter a new password and a different password in Confirm password, then click Save new password</w:t>
             </w:r>
           </w:p>
         </w:tc>
@@ -2334,106 +1329,7 @@
                 <w:rFonts w:ascii="Calibri" w:hAnsi="Calibri"/>
                 <w:sz w:val="21"/>
               </w:rPr>
-              <w:t>Check if a saved account can sign in</w:t>
-            </w:r>
-          </w:p>
-          <w:p>
-            <w:pPr>
-              <w:spacing w:after="0"/>
-            </w:pPr>
-            <w:r>
-              <w:rPr>
-                <w:rFonts w:ascii="Calibri" w:hAnsi="Calibri"/>
-                <w:sz w:val="21"/>
-              </w:rPr>
-              <w:t>Enter a username and password that are saved in the system, then click Sign in</w:t>
-            </w:r>
-          </w:p>
-        </w:tc>
-        <w:tc>
-          <w:tcPr>
-            <w:tcW w:type="dxa" w:w="4700"/>
-          </w:tcPr>
-          <w:p>
-            <w:pPr>
-              <w:spacing w:after="0"/>
-            </w:pPr>
-            <w:r/>
-            <w:r>
-              <w:rPr>
-                <w:rFonts w:ascii="Calibri" w:hAnsi="Calibri"/>
-                <w:sz w:val="21"/>
-              </w:rPr>
-              <w:t>The user is signed in</w:t>
-            </w:r>
-          </w:p>
-        </w:tc>
-        <w:tc>
-          <w:tcPr>
-            <w:tcW w:type="dxa" w:w="2100"/>
-          </w:tcPr>
-          <w:p/>
-        </w:tc>
-        <w:tc>
-          <w:tcPr>
-            <w:tcW w:type="dxa" w:w="1520"/>
-          </w:tcPr>
-          <w:p/>
-        </w:tc>
-        <w:tc>
-          <w:tcPr>
-            <w:tcW w:type="dxa" w:w="1100"/>
-          </w:tcPr>
-          <w:p/>
-        </w:tc>
-      </w:tr>
-      <w:tr>
-        <w:tc>
-          <w:tcPr>
-            <w:tcW w:type="dxa" w:w="1900"/>
-            <w:vMerge/>
-          </w:tcPr>
-          <w:p/>
-        </w:tc>
-        <w:tc>
-          <w:tcPr>
-            <w:tcW w:type="dxa" w:w="600"/>
-          </w:tcPr>
-          <w:p/>
-        </w:tc>
-        <w:tc>
-          <w:tcPr>
-            <w:tcW w:type="dxa" w:w="2300"/>
-          </w:tcPr>
-          <w:p/>
-        </w:tc>
-        <w:tc>
-          <w:tcPr>
-            <w:tcW w:type="dxa" w:w="4500"/>
-          </w:tcPr>
-          <w:p>
-            <w:pPr>
-              <w:spacing w:after="0"/>
-            </w:pPr>
-            <w:r/>
-            <w:r>
-              <w:rPr>
-                <w:rFonts w:ascii="Calibri" w:hAnsi="Calibri"/>
-                <w:sz w:val="21"/>
-              </w:rPr>
-              <w:t>Check if the password is wrong</w:t>
-            </w:r>
-          </w:p>
-          <w:p>
-            <w:pPr>
-              <w:spacing w:after="0"/>
-            </w:pPr>
-            <w:r>
-              <w:rPr>
-                <w:rFonts w:ascii="Calibri" w:hAnsi="Calibri"/>
-                <w:sz w:val="21"/>
-              </w:rPr>
-              <w:t>Enter a username with a wrong password, then click Sign in</w:t>
+              <w:t>Check if the password is wrong: enter a username with a wrong password, then click Sign in</w:t>
             </w:r>
           </w:p>
         </w:tc>
@@ -2452,267 +1348,6 @@
                 <w:sz w:val="21"/>
               </w:rPr>
               <w:t>A message "Invalid username or password" is displayed</w:t>
-            </w:r>
-          </w:p>
-        </w:tc>
-        <w:tc>
-          <w:tcPr>
-            <w:tcW w:type="dxa" w:w="2100"/>
-          </w:tcPr>
-          <w:p/>
-        </w:tc>
-        <w:tc>
-          <w:tcPr>
-            <w:tcW w:type="dxa" w:w="1520"/>
-          </w:tcPr>
-          <w:p/>
-        </w:tc>
-        <w:tc>
-          <w:tcPr>
-            <w:tcW w:type="dxa" w:w="1100"/>
-          </w:tcPr>
-          <w:p/>
-        </w:tc>
-      </w:tr>
-      <w:tr>
-        <w:tc>
-          <w:tcPr>
-            <w:tcW w:type="dxa" w:w="1900"/>
-            <w:vMerge/>
-          </w:tcPr>
-          <w:p/>
-        </w:tc>
-        <w:tc>
-          <w:tcPr>
-            <w:tcW w:type="dxa" w:w="600"/>
-          </w:tcPr>
-          <w:p/>
-        </w:tc>
-        <w:tc>
-          <w:tcPr>
-            <w:tcW w:type="dxa" w:w="2300"/>
-          </w:tcPr>
-          <w:p/>
-        </w:tc>
-        <w:tc>
-          <w:tcPr>
-            <w:tcW w:type="dxa" w:w="4500"/>
-          </w:tcPr>
-          <w:p>
-            <w:pPr>
-              <w:spacing w:after="0"/>
-            </w:pPr>
-            <w:r/>
-            <w:r>
-              <w:rPr>
-                <w:rFonts w:ascii="Calibri" w:hAnsi="Calibri"/>
-                <w:sz w:val="21"/>
-              </w:rPr>
-              <w:t>Check if the email is not yet confirmed</w:t>
-            </w:r>
-          </w:p>
-          <w:p>
-            <w:pPr>
-              <w:spacing w:after="0"/>
-            </w:pPr>
-            <w:r>
-              <w:rPr>
-                <w:rFonts w:ascii="Calibri" w:hAnsi="Calibri"/>
-                <w:sz w:val="21"/>
-              </w:rPr>
-              <w:t>Sign in with an account whose email is not yet confirmed</w:t>
-            </w:r>
-          </w:p>
-        </w:tc>
-        <w:tc>
-          <w:tcPr>
-            <w:tcW w:type="dxa" w:w="4700"/>
-          </w:tcPr>
-          <w:p>
-            <w:pPr>
-              <w:spacing w:after="0"/>
-            </w:pPr>
-            <w:r/>
-            <w:r>
-              <w:rPr>
-                <w:rFonts w:ascii="Calibri" w:hAnsi="Calibri"/>
-                <w:sz w:val="21"/>
-              </w:rPr>
-              <w:t>A message "Please confirm your email address first. Check (email) for the confirmation link." is displayed with a "Resend it" link</w:t>
-            </w:r>
-          </w:p>
-        </w:tc>
-        <w:tc>
-          <w:tcPr>
-            <w:tcW w:type="dxa" w:w="2100"/>
-          </w:tcPr>
-          <w:p/>
-        </w:tc>
-        <w:tc>
-          <w:tcPr>
-            <w:tcW w:type="dxa" w:w="1520"/>
-          </w:tcPr>
-          <w:p/>
-        </w:tc>
-        <w:tc>
-          <w:tcPr>
-            <w:tcW w:type="dxa" w:w="1100"/>
-          </w:tcPr>
-          <w:p/>
-        </w:tc>
-      </w:tr>
-      <w:tr>
-        <w:tc>
-          <w:tcPr>
-            <w:tcW w:type="dxa" w:w="1900"/>
-            <w:vMerge/>
-          </w:tcPr>
-          <w:p/>
-        </w:tc>
-        <w:tc>
-          <w:tcPr>
-            <w:tcW w:type="dxa" w:w="600"/>
-          </w:tcPr>
-          <w:p/>
-        </w:tc>
-        <w:tc>
-          <w:tcPr>
-            <w:tcW w:type="dxa" w:w="2300"/>
-          </w:tcPr>
-          <w:p/>
-        </w:tc>
-        <w:tc>
-          <w:tcPr>
-            <w:tcW w:type="dxa" w:w="4500"/>
-          </w:tcPr>
-          <w:p>
-            <w:pPr>
-              <w:spacing w:after="0"/>
-            </w:pPr>
-            <w:r/>
-            <w:r>
-              <w:rPr>
-                <w:rFonts w:ascii="Calibri" w:hAnsi="Calibri"/>
-                <w:sz w:val="21"/>
-              </w:rPr>
-              <w:t>Check if the account is deactivated</w:t>
-            </w:r>
-          </w:p>
-          <w:p>
-            <w:pPr>
-              <w:spacing w:after="0"/>
-            </w:pPr>
-            <w:r>
-              <w:rPr>
-                <w:rFonts w:ascii="Calibri" w:hAnsi="Calibri"/>
-                <w:sz w:val="21"/>
-              </w:rPr>
-              <w:t>Sign in with an account that was deactivated</w:t>
-            </w:r>
-          </w:p>
-        </w:tc>
-        <w:tc>
-          <w:tcPr>
-            <w:tcW w:type="dxa" w:w="4700"/>
-          </w:tcPr>
-          <w:p>
-            <w:pPr>
-              <w:spacing w:after="0"/>
-            </w:pPr>
-            <w:r/>
-            <w:r>
-              <w:rPr>
-                <w:rFonts w:ascii="Calibri" w:hAnsi="Calibri"/>
-                <w:sz w:val="21"/>
-              </w:rPr>
-              <w:t>A message "Invalid username or password" is displayed and the account cannot sign in</w:t>
-            </w:r>
-          </w:p>
-        </w:tc>
-        <w:tc>
-          <w:tcPr>
-            <w:tcW w:type="dxa" w:w="2100"/>
-          </w:tcPr>
-          <w:p/>
-        </w:tc>
-        <w:tc>
-          <w:tcPr>
-            <w:tcW w:type="dxa" w:w="1520"/>
-          </w:tcPr>
-          <w:p/>
-        </w:tc>
-        <w:tc>
-          <w:tcPr>
-            <w:tcW w:type="dxa" w:w="1100"/>
-          </w:tcPr>
-          <w:p/>
-        </w:tc>
-      </w:tr>
-      <w:tr>
-        <w:tc>
-          <w:tcPr>
-            <w:tcW w:type="dxa" w:w="1900"/>
-            <w:vMerge/>
-          </w:tcPr>
-          <w:p/>
-        </w:tc>
-        <w:tc>
-          <w:tcPr>
-            <w:tcW w:type="dxa" w:w="600"/>
-          </w:tcPr>
-          <w:p/>
-        </w:tc>
-        <w:tc>
-          <w:tcPr>
-            <w:tcW w:type="dxa" w:w="2300"/>
-          </w:tcPr>
-          <w:p/>
-        </w:tc>
-        <w:tc>
-          <w:tcPr>
-            <w:tcW w:type="dxa" w:w="4500"/>
-          </w:tcPr>
-          <w:p>
-            <w:pPr>
-              <w:spacing w:after="0"/>
-            </w:pPr>
-            <w:r/>
-            <w:r>
-              <w:rPr>
-                <w:rFonts w:ascii="Calibri" w:hAnsi="Calibri"/>
-                <w:sz w:val="21"/>
-              </w:rPr>
-              <w:t>Check if the reset link has expired or was used</w:t>
-            </w:r>
-          </w:p>
-          <w:p>
-            <w:pPr>
-              <w:spacing w:after="0"/>
-            </w:pPr>
-            <w:r>
-              <w:rPr>
-                <w:rFonts w:ascii="Calibri" w:hAnsi="Calibri"/>
-                <w:sz w:val="21"/>
-              </w:rPr>
-              <w:t>Open a reset link that has expired or was already used</w:t>
-            </w:r>
-          </w:p>
-        </w:tc>
-        <w:tc>
-          <w:tcPr>
-            <w:tcW w:type="dxa" w:w="4700"/>
-          </w:tcPr>
-          <w:p>
-            <w:pPr>
-              <w:spacing w:after="0"/>
-            </w:pPr>
-            <w:r/>
-            <w:r>
-              <w:rPr>
-                <w:rFonts w:ascii="Calibri" w:hAnsi="Calibri"/>
-                <w:sz w:val="21"/>
-              </w:rPr>
-              <w:t>A message "This reset link is invalid or has expired. Please request a new one." is displayed</w:t>
             </w:r>
           </w:p>
         </w:tc>
@@ -2852,193 +1487,7 @@
                 <w:rFonts w:ascii="Calibri" w:hAnsi="Calibri"/>
                 <w:sz w:val="21"/>
               </w:rPr>
-              <w:t>Check if the Administrator opens the Dashboard</w:t>
-            </w:r>
-          </w:p>
-          <w:p>
-            <w:pPr>
-              <w:spacing w:after="0"/>
-            </w:pPr>
-            <w:r>
-              <w:rPr>
-                <w:rFonts w:ascii="Calibri" w:hAnsi="Calibri"/>
-                <w:sz w:val="21"/>
-              </w:rPr>
-              <w:t>Sign in as Administrator</w:t>
-            </w:r>
-          </w:p>
-        </w:tc>
-        <w:tc>
-          <w:tcPr>
-            <w:tcW w:type="dxa" w:w="4700"/>
-          </w:tcPr>
-          <w:p>
-            <w:pPr>
-              <w:spacing w:after="0"/>
-            </w:pPr>
-            <w:r/>
-            <w:r>
-              <w:rPr>
-                <w:rFonts w:ascii="Calibri" w:hAnsi="Calibri"/>
-                <w:sz w:val="21"/>
-              </w:rPr>
-              <w:t>The Dashboard opens: the administrator's home page, with the shop's figures</w:t>
-            </w:r>
-          </w:p>
-        </w:tc>
-        <w:tc>
-          <w:tcPr>
-            <w:tcW w:type="dxa" w:w="2100"/>
-          </w:tcPr>
-          <w:p/>
-        </w:tc>
-        <w:tc>
-          <w:tcPr>
-            <w:tcW w:type="dxa" w:w="1520"/>
-          </w:tcPr>
-          <w:p/>
-        </w:tc>
-        <w:tc>
-          <w:tcPr>
-            <w:tcW w:type="dxa" w:w="1100"/>
-          </w:tcPr>
-          <w:p/>
-        </w:tc>
-      </w:tr>
-      <w:tr>
-        <w:tc>
-          <w:tcPr>
-            <w:tcW w:type="dxa" w:w="1900"/>
-            <w:vMerge/>
-          </w:tcPr>
-          <w:p/>
-        </w:tc>
-        <w:tc>
-          <w:tcPr>
-            <w:tcW w:type="dxa" w:w="600"/>
-          </w:tcPr>
-          <w:p/>
-        </w:tc>
-        <w:tc>
-          <w:tcPr>
-            <w:tcW w:type="dxa" w:w="2300"/>
-          </w:tcPr>
-          <w:p/>
-        </w:tc>
-        <w:tc>
-          <w:tcPr>
-            <w:tcW w:type="dxa" w:w="4500"/>
-          </w:tcPr>
-          <w:p>
-            <w:pPr>
-              <w:spacing w:after="0"/>
-            </w:pPr>
-            <w:r/>
-            <w:r>
-              <w:rPr>
-                <w:rFonts w:ascii="Calibri" w:hAnsi="Calibri"/>
-                <w:sz w:val="21"/>
-              </w:rPr>
-              <w:t>Check if the Cashier opens the Point of Sale</w:t>
-            </w:r>
-          </w:p>
-          <w:p>
-            <w:pPr>
-              <w:spacing w:after="0"/>
-            </w:pPr>
-            <w:r>
-              <w:rPr>
-                <w:rFonts w:ascii="Calibri" w:hAnsi="Calibri"/>
-                <w:sz w:val="21"/>
-              </w:rPr>
-              <w:t>Sign in as Cashier</w:t>
-            </w:r>
-          </w:p>
-        </w:tc>
-        <w:tc>
-          <w:tcPr>
-            <w:tcW w:type="dxa" w:w="4700"/>
-          </w:tcPr>
-          <w:p>
-            <w:pPr>
-              <w:spacing w:after="0"/>
-            </w:pPr>
-            <w:r/>
-            <w:r>
-              <w:rPr>
-                <w:rFonts w:ascii="Calibri" w:hAnsi="Calibri"/>
-                <w:sz w:val="21"/>
-              </w:rPr>
-              <w:t>The Point of Sale opens, not the Dashboard, with "Cashier: (name)" of the cashier who signed in</w:t>
-            </w:r>
-          </w:p>
-        </w:tc>
-        <w:tc>
-          <w:tcPr>
-            <w:tcW w:type="dxa" w:w="2100"/>
-          </w:tcPr>
-          <w:p/>
-        </w:tc>
-        <w:tc>
-          <w:tcPr>
-            <w:tcW w:type="dxa" w:w="1520"/>
-          </w:tcPr>
-          <w:p/>
-        </w:tc>
-        <w:tc>
-          <w:tcPr>
-            <w:tcW w:type="dxa" w:w="1100"/>
-          </w:tcPr>
-          <w:p/>
-        </w:tc>
-      </w:tr>
-      <w:tr>
-        <w:tc>
-          <w:tcPr>
-            <w:tcW w:type="dxa" w:w="1900"/>
-            <w:vMerge/>
-          </w:tcPr>
-          <w:p/>
-        </w:tc>
-        <w:tc>
-          <w:tcPr>
-            <w:tcW w:type="dxa" w:w="600"/>
-          </w:tcPr>
-          <w:p/>
-        </w:tc>
-        <w:tc>
-          <w:tcPr>
-            <w:tcW w:type="dxa" w:w="2300"/>
-          </w:tcPr>
-          <w:p/>
-        </w:tc>
-        <w:tc>
-          <w:tcPr>
-            <w:tcW w:type="dxa" w:w="4500"/>
-          </w:tcPr>
-          <w:p>
-            <w:pPr>
-              <w:spacing w:after="0"/>
-            </w:pPr>
-            <w:r/>
-            <w:r>
-              <w:rPr>
-                <w:rFonts w:ascii="Calibri" w:hAnsi="Calibri"/>
-                <w:sz w:val="21"/>
-              </w:rPr>
-              <w:t>Check if the Supplier opens the Supplier Portal</w:t>
-            </w:r>
-          </w:p>
-          <w:p>
-            <w:pPr>
-              <w:spacing w:after="0"/>
-            </w:pPr>
-            <w:r>
-              <w:rPr>
-                <w:rFonts w:ascii="Calibri" w:hAnsi="Calibri"/>
-                <w:sz w:val="21"/>
-              </w:rPr>
-              <w:t>Sign in as Supplier</w:t>
+              <w:t>Check if the Supplier opens the Supplier Portal: sign in as Supplier</w:t>
             </w:r>
           </w:p>
         </w:tc>
@@ -3113,19 +1562,7 @@
                 <w:rFonts w:ascii="Calibri" w:hAnsi="Calibri"/>
                 <w:sz w:val="21"/>
               </w:rPr>
-              <w:t>Check if "Keep me signed in" keeps the session</w:t>
-            </w:r>
-          </w:p>
-          <w:p>
-            <w:pPr>
-              <w:spacing w:after="0"/>
-            </w:pPr>
-            <w:r>
-              <w:rPr>
-                <w:rFonts w:ascii="Calibri" w:hAnsi="Calibri"/>
-                <w:sz w:val="21"/>
-              </w:rPr>
-              <w:t>Tick "Keep me signed in", sign in, close the browser and open FETCH again</w:t>
+              <w:t>Check if "Keep me signed in" keeps the session: tick "Keep me signed in", sign in, close the browser and open FETCH again</w:t>
             </w:r>
           </w:p>
         </w:tc>
@@ -3367,19 +1804,7 @@
                 <w:rFonts w:ascii="Calibri" w:hAnsi="Calibri"/>
                 <w:sz w:val="21"/>
               </w:rPr>
-              <w:t>Check if a supplier can open the Dashboard</w:t>
-            </w:r>
-          </w:p>
-          <w:p>
-            <w:pPr>
-              <w:spacing w:after="0"/>
-            </w:pPr>
-            <w:r>
-              <w:rPr>
-                <w:rFonts w:ascii="Calibri" w:hAnsi="Calibri"/>
-                <w:sz w:val="21"/>
-              </w:rPr>
-              <w:t>Sign in as Supplier, then type the address of the Dashboard (dashboard.html)</w:t>
+              <w:t>Check if a supplier can open the Dashboard: sign in as Supplier, then type the address of the Dashboard (dashboard.html)</w:t>
             </w:r>
           </w:p>
         </w:tc>
@@ -3621,106 +2046,7 @@
                 <w:rFonts w:ascii="Calibri" w:hAnsi="Calibri"/>
                 <w:sz w:val="21"/>
               </w:rPr>
-              <w:t>Check if a complete profile is saved</w:t>
-            </w:r>
-          </w:p>
-          <w:p>
-            <w:pPr>
-              <w:spacing w:after="0"/>
-            </w:pPr>
-            <w:r>
-              <w:rPr>
-                <w:rFonts w:ascii="Calibri" w:hAnsi="Calibri"/>
-                <w:sz w:val="21"/>
-              </w:rPr>
-              <w:t>In Profile, fill in Full name and Email, then click Save changes</w:t>
-            </w:r>
-          </w:p>
-        </w:tc>
-        <w:tc>
-          <w:tcPr>
-            <w:tcW w:type="dxa" w:w="4700"/>
-          </w:tcPr>
-          <w:p>
-            <w:pPr>
-              <w:spacing w:after="0"/>
-            </w:pPr>
-            <w:r/>
-            <w:r>
-              <w:rPr>
-                <w:rFonts w:ascii="Calibri" w:hAnsi="Calibri"/>
-                <w:sz w:val="21"/>
-              </w:rPr>
-              <w:t>A message "Profile updated" is displayed</w:t>
-            </w:r>
-          </w:p>
-        </w:tc>
-        <w:tc>
-          <w:tcPr>
-            <w:tcW w:type="dxa" w:w="2100"/>
-          </w:tcPr>
-          <w:p/>
-        </w:tc>
-        <w:tc>
-          <w:tcPr>
-            <w:tcW w:type="dxa" w:w="1520"/>
-          </w:tcPr>
-          <w:p/>
-        </w:tc>
-        <w:tc>
-          <w:tcPr>
-            <w:tcW w:type="dxa" w:w="1100"/>
-          </w:tcPr>
-          <w:p/>
-        </w:tc>
-      </w:tr>
-      <w:tr>
-        <w:tc>
-          <w:tcPr>
-            <w:tcW w:type="dxa" w:w="1900"/>
-            <w:vMerge/>
-          </w:tcPr>
-          <w:p/>
-        </w:tc>
-        <w:tc>
-          <w:tcPr>
-            <w:tcW w:type="dxa" w:w="600"/>
-          </w:tcPr>
-          <w:p/>
-        </w:tc>
-        <w:tc>
-          <w:tcPr>
-            <w:tcW w:type="dxa" w:w="2300"/>
-          </w:tcPr>
-          <w:p/>
-        </w:tc>
-        <w:tc>
-          <w:tcPr>
-            <w:tcW w:type="dxa" w:w="4500"/>
-          </w:tcPr>
-          <w:p>
-            <w:pPr>
-              <w:spacing w:after="0"/>
-            </w:pPr>
-            <w:r/>
-            <w:r>
-              <w:rPr>
-                <w:rFonts w:ascii="Calibri" w:hAnsi="Calibri"/>
-                <w:sz w:val="21"/>
-              </w:rPr>
-              <w:t>Check if Full name is empty</w:t>
-            </w:r>
-          </w:p>
-          <w:p>
-            <w:pPr>
-              <w:spacing w:after="0"/>
-            </w:pPr>
-            <w:r>
-              <w:rPr>
-                <w:rFonts w:ascii="Calibri" w:hAnsi="Calibri"/>
-                <w:sz w:val="21"/>
-              </w:rPr>
-              <w:t>In Profile, clear Full name, then click Save changes</w:t>
+              <w:t>Check if Full name is empty: in Profile, clear Full name, then click Save changes</w:t>
             </w:r>
           </w:p>
         </w:tc>
@@ -3739,267 +2065,6 @@
                 <w:sz w:val="21"/>
               </w:rPr>
               <w:t>A message "Please enter your full name" is displayed</w:t>
-            </w:r>
-          </w:p>
-        </w:tc>
-        <w:tc>
-          <w:tcPr>
-            <w:tcW w:type="dxa" w:w="2100"/>
-          </w:tcPr>
-          <w:p/>
-        </w:tc>
-        <w:tc>
-          <w:tcPr>
-            <w:tcW w:type="dxa" w:w="1520"/>
-          </w:tcPr>
-          <w:p/>
-        </w:tc>
-        <w:tc>
-          <w:tcPr>
-            <w:tcW w:type="dxa" w:w="1100"/>
-          </w:tcPr>
-          <w:p/>
-        </w:tc>
-      </w:tr>
-      <w:tr>
-        <w:tc>
-          <w:tcPr>
-            <w:tcW w:type="dxa" w:w="1900"/>
-            <w:vMerge/>
-          </w:tcPr>
-          <w:p/>
-        </w:tc>
-        <w:tc>
-          <w:tcPr>
-            <w:tcW w:type="dxa" w:w="600"/>
-          </w:tcPr>
-          <w:p/>
-        </w:tc>
-        <w:tc>
-          <w:tcPr>
-            <w:tcW w:type="dxa" w:w="2300"/>
-          </w:tcPr>
-          <w:p/>
-        </w:tc>
-        <w:tc>
-          <w:tcPr>
-            <w:tcW w:type="dxa" w:w="4500"/>
-          </w:tcPr>
-          <w:p>
-            <w:pPr>
-              <w:spacing w:after="0"/>
-            </w:pPr>
-            <w:r/>
-            <w:r>
-              <w:rPr>
-                <w:rFonts w:ascii="Calibri" w:hAnsi="Calibri"/>
-                <w:sz w:val="21"/>
-              </w:rPr>
-              <w:t>Check if Current password is empty</w:t>
-            </w:r>
-          </w:p>
-          <w:p>
-            <w:pPr>
-              <w:spacing w:after="0"/>
-            </w:pPr>
-            <w:r>
-              <w:rPr>
-                <w:rFonts w:ascii="Calibri" w:hAnsi="Calibri"/>
-                <w:sz w:val="21"/>
-              </w:rPr>
-              <w:t>In Password, leave Current password empty, then click Update password</w:t>
-            </w:r>
-          </w:p>
-        </w:tc>
-        <w:tc>
-          <w:tcPr>
-            <w:tcW w:type="dxa" w:w="4700"/>
-          </w:tcPr>
-          <w:p>
-            <w:pPr>
-              <w:spacing w:after="0"/>
-            </w:pPr>
-            <w:r/>
-            <w:r>
-              <w:rPr>
-                <w:rFonts w:ascii="Calibri" w:hAnsi="Calibri"/>
-                <w:sz w:val="21"/>
-              </w:rPr>
-              <w:t>A message "Enter current password" is displayed</w:t>
-            </w:r>
-          </w:p>
-        </w:tc>
-        <w:tc>
-          <w:tcPr>
-            <w:tcW w:type="dxa" w:w="2100"/>
-          </w:tcPr>
-          <w:p/>
-        </w:tc>
-        <w:tc>
-          <w:tcPr>
-            <w:tcW w:type="dxa" w:w="1520"/>
-          </w:tcPr>
-          <w:p/>
-        </w:tc>
-        <w:tc>
-          <w:tcPr>
-            <w:tcW w:type="dxa" w:w="1100"/>
-          </w:tcPr>
-          <w:p/>
-        </w:tc>
-      </w:tr>
-      <w:tr>
-        <w:tc>
-          <w:tcPr>
-            <w:tcW w:type="dxa" w:w="1900"/>
-            <w:vMerge/>
-          </w:tcPr>
-          <w:p/>
-        </w:tc>
-        <w:tc>
-          <w:tcPr>
-            <w:tcW w:type="dxa" w:w="600"/>
-          </w:tcPr>
-          <w:p/>
-        </w:tc>
-        <w:tc>
-          <w:tcPr>
-            <w:tcW w:type="dxa" w:w="2300"/>
-          </w:tcPr>
-          <w:p/>
-        </w:tc>
-        <w:tc>
-          <w:tcPr>
-            <w:tcW w:type="dxa" w:w="4500"/>
-          </w:tcPr>
-          <w:p>
-            <w:pPr>
-              <w:spacing w:after="0"/>
-            </w:pPr>
-            <w:r/>
-            <w:r>
-              <w:rPr>
-                <w:rFonts w:ascii="Calibri" w:hAnsi="Calibri"/>
-                <w:sz w:val="21"/>
-              </w:rPr>
-              <w:t>Check if New password is empty</w:t>
-            </w:r>
-          </w:p>
-          <w:p>
-            <w:pPr>
-              <w:spacing w:after="0"/>
-            </w:pPr>
-            <w:r>
-              <w:rPr>
-                <w:rFonts w:ascii="Calibri" w:hAnsi="Calibri"/>
-                <w:sz w:val="21"/>
-              </w:rPr>
-              <w:t>In Password, leave New password empty, then click Update password</w:t>
-            </w:r>
-          </w:p>
-        </w:tc>
-        <w:tc>
-          <w:tcPr>
-            <w:tcW w:type="dxa" w:w="4700"/>
-          </w:tcPr>
-          <w:p>
-            <w:pPr>
-              <w:spacing w:after="0"/>
-            </w:pPr>
-            <w:r/>
-            <w:r>
-              <w:rPr>
-                <w:rFonts w:ascii="Calibri" w:hAnsi="Calibri"/>
-                <w:sz w:val="21"/>
-              </w:rPr>
-              <w:t>A message "Enter new password" is displayed</w:t>
-            </w:r>
-          </w:p>
-        </w:tc>
-        <w:tc>
-          <w:tcPr>
-            <w:tcW w:type="dxa" w:w="2100"/>
-          </w:tcPr>
-          <w:p/>
-        </w:tc>
-        <w:tc>
-          <w:tcPr>
-            <w:tcW w:type="dxa" w:w="1520"/>
-          </w:tcPr>
-          <w:p/>
-        </w:tc>
-        <w:tc>
-          <w:tcPr>
-            <w:tcW w:type="dxa" w:w="1100"/>
-          </w:tcPr>
-          <w:p/>
-        </w:tc>
-      </w:tr>
-      <w:tr>
-        <w:tc>
-          <w:tcPr>
-            <w:tcW w:type="dxa" w:w="1900"/>
-            <w:vMerge/>
-          </w:tcPr>
-          <w:p/>
-        </w:tc>
-        <w:tc>
-          <w:tcPr>
-            <w:tcW w:type="dxa" w:w="600"/>
-          </w:tcPr>
-          <w:p/>
-        </w:tc>
-        <w:tc>
-          <w:tcPr>
-            <w:tcW w:type="dxa" w:w="2300"/>
-          </w:tcPr>
-          <w:p/>
-        </w:tc>
-        <w:tc>
-          <w:tcPr>
-            <w:tcW w:type="dxa" w:w="4500"/>
-          </w:tcPr>
-          <w:p>
-            <w:pPr>
-              <w:spacing w:after="0"/>
-            </w:pPr>
-            <w:r/>
-            <w:r>
-              <w:rPr>
-                <w:rFonts w:ascii="Calibri" w:hAnsi="Calibri"/>
-                <w:sz w:val="21"/>
-              </w:rPr>
-              <w:t>Check if Confirm new password is empty</w:t>
-            </w:r>
-          </w:p>
-          <w:p>
-            <w:pPr>
-              <w:spacing w:after="0"/>
-            </w:pPr>
-            <w:r>
-              <w:rPr>
-                <w:rFonts w:ascii="Calibri" w:hAnsi="Calibri"/>
-                <w:sz w:val="21"/>
-              </w:rPr>
-              <w:t>In Password, leave Confirm new password empty, then click Update password</w:t>
-            </w:r>
-          </w:p>
-        </w:tc>
-        <w:tc>
-          <w:tcPr>
-            <w:tcW w:type="dxa" w:w="4700"/>
-          </w:tcPr>
-          <w:p>
-            <w:pPr>
-              <w:spacing w:after="0"/>
-            </w:pPr>
-            <w:r/>
-            <w:r>
-              <w:rPr>
-                <w:rFonts w:ascii="Calibri" w:hAnsi="Calibri"/>
-                <w:sz w:val="21"/>
-              </w:rPr>
-              <w:t>A message "Confirm new password" is displayed</w:t>
             </w:r>
           </w:p>
         </w:tc>
@@ -4139,106 +2204,7 @@
                 <w:rFonts w:ascii="Calibri" w:hAnsi="Calibri"/>
                 <w:sz w:val="21"/>
               </w:rPr>
-              <w:t>Check if a correct email is saved</w:t>
-            </w:r>
-          </w:p>
-          <w:p>
-            <w:pPr>
-              <w:spacing w:after="0"/>
-            </w:pPr>
-            <w:r>
-              <w:rPr>
-                <w:rFonts w:ascii="Calibri" w:hAnsi="Calibri"/>
-                <w:sz w:val="21"/>
-              </w:rPr>
-              <w:t>In Profile, enter an email with @, then click Save changes</w:t>
-            </w:r>
-          </w:p>
-        </w:tc>
-        <w:tc>
-          <w:tcPr>
-            <w:tcW w:type="dxa" w:w="4700"/>
-          </w:tcPr>
-          <w:p>
-            <w:pPr>
-              <w:spacing w:after="0"/>
-            </w:pPr>
-            <w:r/>
-            <w:r>
-              <w:rPr>
-                <w:rFonts w:ascii="Calibri" w:hAnsi="Calibri"/>
-                <w:sz w:val="21"/>
-              </w:rPr>
-              <w:t>The profile is saved</w:t>
-            </w:r>
-          </w:p>
-        </w:tc>
-        <w:tc>
-          <w:tcPr>
-            <w:tcW w:type="dxa" w:w="2100"/>
-          </w:tcPr>
-          <w:p/>
-        </w:tc>
-        <w:tc>
-          <w:tcPr>
-            <w:tcW w:type="dxa" w:w="1520"/>
-          </w:tcPr>
-          <w:p/>
-        </w:tc>
-        <w:tc>
-          <w:tcPr>
-            <w:tcW w:type="dxa" w:w="1100"/>
-          </w:tcPr>
-          <w:p/>
-        </w:tc>
-      </w:tr>
-      <w:tr>
-        <w:tc>
-          <w:tcPr>
-            <w:tcW w:type="dxa" w:w="1900"/>
-            <w:vMerge/>
-          </w:tcPr>
-          <w:p/>
-        </w:tc>
-        <w:tc>
-          <w:tcPr>
-            <w:tcW w:type="dxa" w:w="600"/>
-          </w:tcPr>
-          <w:p/>
-        </w:tc>
-        <w:tc>
-          <w:tcPr>
-            <w:tcW w:type="dxa" w:w="2300"/>
-          </w:tcPr>
-          <w:p/>
-        </w:tc>
-        <w:tc>
-          <w:tcPr>
-            <w:tcW w:type="dxa" w:w="4500"/>
-          </w:tcPr>
-          <w:p>
-            <w:pPr>
-              <w:spacing w:after="0"/>
-            </w:pPr>
-            <w:r/>
-            <w:r>
-              <w:rPr>
-                <w:rFonts w:ascii="Calibri" w:hAnsi="Calibri"/>
-                <w:sz w:val="21"/>
-              </w:rPr>
-              <w:t>Check if the email has no @</w:t>
-            </w:r>
-          </w:p>
-          <w:p>
-            <w:pPr>
-              <w:spacing w:after="0"/>
-            </w:pPr>
-            <w:r>
-              <w:rPr>
-                <w:rFonts w:ascii="Calibri" w:hAnsi="Calibri"/>
-                <w:sz w:val="21"/>
-              </w:rPr>
-              <w:t>In Profile, enter an email without @, then click Save changes</w:t>
+              <w:t>Check if the email has no @: in Profile, enter an email without @, then click Save changes</w:t>
             </w:r>
           </w:p>
         </w:tc>
@@ -4257,180 +2223,6 @@
                 <w:sz w:val="21"/>
               </w:rPr>
               <w:t>A message "Please enter a valid email address" is displayed</w:t>
-            </w:r>
-          </w:p>
-        </w:tc>
-        <w:tc>
-          <w:tcPr>
-            <w:tcW w:type="dxa" w:w="2100"/>
-          </w:tcPr>
-          <w:p/>
-        </w:tc>
-        <w:tc>
-          <w:tcPr>
-            <w:tcW w:type="dxa" w:w="1520"/>
-          </w:tcPr>
-          <w:p/>
-        </w:tc>
-        <w:tc>
-          <w:tcPr>
-            <w:tcW w:type="dxa" w:w="1100"/>
-          </w:tcPr>
-          <w:p/>
-        </w:tc>
-      </w:tr>
-      <w:tr>
-        <w:tc>
-          <w:tcPr>
-            <w:tcW w:type="dxa" w:w="1900"/>
-            <w:vMerge/>
-          </w:tcPr>
-          <w:p/>
-        </w:tc>
-        <w:tc>
-          <w:tcPr>
-            <w:tcW w:type="dxa" w:w="600"/>
-          </w:tcPr>
-          <w:p/>
-        </w:tc>
-        <w:tc>
-          <w:tcPr>
-            <w:tcW w:type="dxa" w:w="2300"/>
-          </w:tcPr>
-          <w:p/>
-        </w:tc>
-        <w:tc>
-          <w:tcPr>
-            <w:tcW w:type="dxa" w:w="4500"/>
-          </w:tcPr>
-          <w:p>
-            <w:pPr>
-              <w:spacing w:after="0"/>
-            </w:pPr>
-            <w:r/>
-            <w:r>
-              <w:rPr>
-                <w:rFonts w:ascii="Calibri" w:hAnsi="Calibri"/>
-                <w:sz w:val="21"/>
-              </w:rPr>
-              <w:t>Check if the new password is too weak</w:t>
-            </w:r>
-          </w:p>
-          <w:p>
-            <w:pPr>
-              <w:spacing w:after="0"/>
-            </w:pPr>
-            <w:r>
-              <w:rPr>
-                <w:rFonts w:ascii="Calibri" w:hAnsi="Calibri"/>
-                <w:sz w:val="21"/>
-              </w:rPr>
-              <w:t>In Password, enter a new password without a number or special character</w:t>
-            </w:r>
-          </w:p>
-        </w:tc>
-        <w:tc>
-          <w:tcPr>
-            <w:tcW w:type="dxa" w:w="4700"/>
-          </w:tcPr>
-          <w:p>
-            <w:pPr>
-              <w:spacing w:after="0"/>
-            </w:pPr>
-            <w:r/>
-            <w:r>
-              <w:rPr>
-                <w:rFonts w:ascii="Calibri" w:hAnsi="Calibri"/>
-                <w:sz w:val="21"/>
-              </w:rPr>
-              <w:t>A message "Password too weak" is displayed with the missing rule</w:t>
-            </w:r>
-          </w:p>
-        </w:tc>
-        <w:tc>
-          <w:tcPr>
-            <w:tcW w:type="dxa" w:w="2100"/>
-          </w:tcPr>
-          <w:p/>
-        </w:tc>
-        <w:tc>
-          <w:tcPr>
-            <w:tcW w:type="dxa" w:w="1520"/>
-          </w:tcPr>
-          <w:p/>
-        </w:tc>
-        <w:tc>
-          <w:tcPr>
-            <w:tcW w:type="dxa" w:w="1100"/>
-          </w:tcPr>
-          <w:p/>
-        </w:tc>
-      </w:tr>
-      <w:tr>
-        <w:tc>
-          <w:tcPr>
-            <w:tcW w:type="dxa" w:w="1900"/>
-            <w:vMerge/>
-          </w:tcPr>
-          <w:p/>
-        </w:tc>
-        <w:tc>
-          <w:tcPr>
-            <w:tcW w:type="dxa" w:w="600"/>
-          </w:tcPr>
-          <w:p/>
-        </w:tc>
-        <w:tc>
-          <w:tcPr>
-            <w:tcW w:type="dxa" w:w="2300"/>
-          </w:tcPr>
-          <w:p/>
-        </w:tc>
-        <w:tc>
-          <w:tcPr>
-            <w:tcW w:type="dxa" w:w="4500"/>
-          </w:tcPr>
-          <w:p>
-            <w:pPr>
-              <w:spacing w:after="0"/>
-            </w:pPr>
-            <w:r/>
-            <w:r>
-              <w:rPr>
-                <w:rFonts w:ascii="Calibri" w:hAnsi="Calibri"/>
-                <w:sz w:val="21"/>
-              </w:rPr>
-              <w:t>Check if the photo is not an image</w:t>
-            </w:r>
-          </w:p>
-          <w:p>
-            <w:pPr>
-              <w:spacing w:after="0"/>
-            </w:pPr>
-            <w:r>
-              <w:rPr>
-                <w:rFonts w:ascii="Calibri" w:hAnsi="Calibri"/>
-                <w:sz w:val="21"/>
-              </w:rPr>
-              <w:t>In Profile, upload a file that is not an image as the photo</w:t>
-            </w:r>
-          </w:p>
-        </w:tc>
-        <w:tc>
-          <w:tcPr>
-            <w:tcW w:type="dxa" w:w="4700"/>
-          </w:tcPr>
-          <w:p>
-            <w:pPr>
-              <w:spacing w:after="0"/>
-            </w:pPr>
-            <w:r/>
-            <w:r>
-              <w:rPr>
-                <w:rFonts w:ascii="Calibri" w:hAnsi="Calibri"/>
-                <w:sz w:val="21"/>
-              </w:rPr>
-              <w:t>A message "Please choose an image file" is displayed (a damaged picture shows "That image could not be loaded")</w:t>
             </w:r>
           </w:p>
         </w:tc>
@@ -4570,193 +2362,7 @@
                 <w:rFonts w:ascii="Calibri" w:hAnsi="Calibri"/>
                 <w:sz w:val="21"/>
               </w:rPr>
-              <w:t>Check if Session shows the signed-in user</w:t>
-            </w:r>
-          </w:p>
-          <w:p>
-            <w:pPr>
-              <w:spacing w:after="0"/>
-            </w:pPr>
-            <w:r>
-              <w:rPr>
-                <w:rFonts w:ascii="Calibri" w:hAnsi="Calibri"/>
-                <w:sz w:val="21"/>
-              </w:rPr>
-              <w:t>Click the Session tab</w:t>
-            </w:r>
-          </w:p>
-        </w:tc>
-        <w:tc>
-          <w:tcPr>
-            <w:tcW w:type="dxa" w:w="4700"/>
-          </w:tcPr>
-          <w:p>
-            <w:pPr>
-              <w:spacing w:after="0"/>
-            </w:pPr>
-            <w:r/>
-            <w:r>
-              <w:rPr>
-                <w:rFonts w:ascii="Calibri" w:hAnsi="Calibri"/>
-                <w:sz w:val="21"/>
-              </w:rPr>
-              <w:t>The full name, role and account status of the signed-in user are displayed (the Cashier role reads "Staff")</w:t>
-            </w:r>
-          </w:p>
-        </w:tc>
-        <w:tc>
-          <w:tcPr>
-            <w:tcW w:type="dxa" w:w="2100"/>
-          </w:tcPr>
-          <w:p/>
-        </w:tc>
-        <w:tc>
-          <w:tcPr>
-            <w:tcW w:type="dxa" w:w="1520"/>
-          </w:tcPr>
-          <w:p/>
-        </w:tc>
-        <w:tc>
-          <w:tcPr>
-            <w:tcW w:type="dxa" w:w="1100"/>
-          </w:tcPr>
-          <w:p/>
-        </w:tc>
-      </w:tr>
-      <w:tr>
-        <w:tc>
-          <w:tcPr>
-            <w:tcW w:type="dxa" w:w="1900"/>
-            <w:vMerge/>
-          </w:tcPr>
-          <w:p/>
-        </w:tc>
-        <w:tc>
-          <w:tcPr>
-            <w:tcW w:type="dxa" w:w="600"/>
-          </w:tcPr>
-          <w:p/>
-        </w:tc>
-        <w:tc>
-          <w:tcPr>
-            <w:tcW w:type="dxa" w:w="2300"/>
-          </w:tcPr>
-          <w:p/>
-        </w:tc>
-        <w:tc>
-          <w:tcPr>
-            <w:tcW w:type="dxa" w:w="4500"/>
-          </w:tcPr>
-          <w:p>
-            <w:pPr>
-              <w:spacing w:after="0"/>
-            </w:pPr>
-            <w:r/>
-            <w:r>
-              <w:rPr>
-                <w:rFonts w:ascii="Calibri" w:hAnsi="Calibri"/>
-                <w:sz w:val="21"/>
-              </w:rPr>
-              <w:t>Check if Profile shows the signed-in user</w:t>
-            </w:r>
-          </w:p>
-          <w:p>
-            <w:pPr>
-              <w:spacing w:after="0"/>
-            </w:pPr>
-            <w:r>
-              <w:rPr>
-                <w:rFonts w:ascii="Calibri" w:hAnsi="Calibri"/>
-                <w:sz w:val="21"/>
-              </w:rPr>
-              <w:t>Click the Profile tab</w:t>
-            </w:r>
-          </w:p>
-        </w:tc>
-        <w:tc>
-          <w:tcPr>
-            <w:tcW w:type="dxa" w:w="4700"/>
-          </w:tcPr>
-          <w:p>
-            <w:pPr>
-              <w:spacing w:after="0"/>
-            </w:pPr>
-            <w:r/>
-            <w:r>
-              <w:rPr>
-                <w:rFonts w:ascii="Calibri" w:hAnsi="Calibri"/>
-                <w:sz w:val="21"/>
-              </w:rPr>
-              <w:t>The full name and email of the signed-in user are displayed</w:t>
-            </w:r>
-          </w:p>
-        </w:tc>
-        <w:tc>
-          <w:tcPr>
-            <w:tcW w:type="dxa" w:w="2100"/>
-          </w:tcPr>
-          <w:p/>
-        </w:tc>
-        <w:tc>
-          <w:tcPr>
-            <w:tcW w:type="dxa" w:w="1520"/>
-          </w:tcPr>
-          <w:p/>
-        </w:tc>
-        <w:tc>
-          <w:tcPr>
-            <w:tcW w:type="dxa" w:w="1100"/>
-          </w:tcPr>
-          <w:p/>
-        </w:tc>
-      </w:tr>
-      <w:tr>
-        <w:tc>
-          <w:tcPr>
-            <w:tcW w:type="dxa" w:w="1900"/>
-            <w:vMerge/>
-          </w:tcPr>
-          <w:p/>
-        </w:tc>
-        <w:tc>
-          <w:tcPr>
-            <w:tcW w:type="dxa" w:w="600"/>
-          </w:tcPr>
-          <w:p/>
-        </w:tc>
-        <w:tc>
-          <w:tcPr>
-            <w:tcW w:type="dxa" w:w="2300"/>
-          </w:tcPr>
-          <w:p/>
-        </w:tc>
-        <w:tc>
-          <w:tcPr>
-            <w:tcW w:type="dxa" w:w="4500"/>
-          </w:tcPr>
-          <w:p>
-            <w:pPr>
-              <w:spacing w:after="0"/>
-            </w:pPr>
-            <w:r/>
-            <w:r>
-              <w:rPr>
-                <w:rFonts w:ascii="Calibri" w:hAnsi="Calibri"/>
-                <w:sz w:val="21"/>
-              </w:rPr>
-              <w:t>Check if the two passwords do not match</w:t>
-            </w:r>
-          </w:p>
-          <w:p>
-            <w:pPr>
-              <w:spacing w:after="0"/>
-            </w:pPr>
-            <w:r>
-              <w:rPr>
-                <w:rFonts w:ascii="Calibri" w:hAnsi="Calibri"/>
-                <w:sz w:val="21"/>
-              </w:rPr>
-              <w:t>In Password, enter a different password in Confirm new password</w:t>
+              <w:t>Check if the two passwords do not match: in Password, enter a different password in Confirm new password</w:t>
             </w:r>
           </w:p>
         </w:tc>
@@ -4914,106 +2520,7 @@
                 <w:rFonts w:ascii="Calibri" w:hAnsi="Calibri"/>
                 <w:sz w:val="21"/>
               </w:rPr>
-              <w:t>Check if a new email is saved</w:t>
-            </w:r>
-          </w:p>
-          <w:p>
-            <w:pPr>
-              <w:spacing w:after="0"/>
-            </w:pPr>
-            <w:r>
-              <w:rPr>
-                <w:rFonts w:ascii="Calibri" w:hAnsi="Calibri"/>
-                <w:sz w:val="21"/>
-              </w:rPr>
-              <w:t>In Profile, enter an email no other account uses, then click Save changes</w:t>
-            </w:r>
-          </w:p>
-        </w:tc>
-        <w:tc>
-          <w:tcPr>
-            <w:tcW w:type="dxa" w:w="4700"/>
-          </w:tcPr>
-          <w:p>
-            <w:pPr>
-              <w:spacing w:after="0"/>
-            </w:pPr>
-            <w:r/>
-            <w:r>
-              <w:rPr>
-                <w:rFonts w:ascii="Calibri" w:hAnsi="Calibri"/>
-                <w:sz w:val="21"/>
-              </w:rPr>
-              <w:t>The profile is saved</w:t>
-            </w:r>
-          </w:p>
-        </w:tc>
-        <w:tc>
-          <w:tcPr>
-            <w:tcW w:type="dxa" w:w="2100"/>
-          </w:tcPr>
-          <w:p/>
-        </w:tc>
-        <w:tc>
-          <w:tcPr>
-            <w:tcW w:type="dxa" w:w="1520"/>
-          </w:tcPr>
-          <w:p/>
-        </w:tc>
-        <w:tc>
-          <w:tcPr>
-            <w:tcW w:type="dxa" w:w="1100"/>
-          </w:tcPr>
-          <w:p/>
-        </w:tc>
-      </w:tr>
-      <w:tr>
-        <w:tc>
-          <w:tcPr>
-            <w:tcW w:type="dxa" w:w="1900"/>
-            <w:vMerge/>
-          </w:tcPr>
-          <w:p/>
-        </w:tc>
-        <w:tc>
-          <w:tcPr>
-            <w:tcW w:type="dxa" w:w="600"/>
-          </w:tcPr>
-          <w:p/>
-        </w:tc>
-        <w:tc>
-          <w:tcPr>
-            <w:tcW w:type="dxa" w:w="2300"/>
-          </w:tcPr>
-          <w:p/>
-        </w:tc>
-        <w:tc>
-          <w:tcPr>
-            <w:tcW w:type="dxa" w:w="4500"/>
-          </w:tcPr>
-          <w:p>
-            <w:pPr>
-              <w:spacing w:after="0"/>
-            </w:pPr>
-            <w:r/>
-            <w:r>
-              <w:rPr>
-                <w:rFonts w:ascii="Calibri" w:hAnsi="Calibri"/>
-                <w:sz w:val="21"/>
-              </w:rPr>
-              <w:t>Check if the current password is wrong</w:t>
-            </w:r>
-          </w:p>
-          <w:p>
-            <w:pPr>
-              <w:spacing w:after="0"/>
-            </w:pPr>
-            <w:r>
-              <w:rPr>
-                <w:rFonts w:ascii="Calibri" w:hAnsi="Calibri"/>
-                <w:sz w:val="21"/>
-              </w:rPr>
-              <w:t>In Password, enter a wrong current password, then click Update password</w:t>
+              <w:t>Check if the current password is wrong: in Password, enter a wrong current password, then click Update password</w:t>
             </w:r>
           </w:p>
         </w:tc>
@@ -5032,93 +2539,6 @@
                 <w:sz w:val="21"/>
               </w:rPr>
               <w:t>A message "Password not changed" is displayed with "Current password is incorrect"</w:t>
-            </w:r>
-          </w:p>
-        </w:tc>
-        <w:tc>
-          <w:tcPr>
-            <w:tcW w:type="dxa" w:w="2100"/>
-          </w:tcPr>
-          <w:p/>
-        </w:tc>
-        <w:tc>
-          <w:tcPr>
-            <w:tcW w:type="dxa" w:w="1520"/>
-          </w:tcPr>
-          <w:p/>
-        </w:tc>
-        <w:tc>
-          <w:tcPr>
-            <w:tcW w:type="dxa" w:w="1100"/>
-          </w:tcPr>
-          <w:p/>
-        </w:tc>
-      </w:tr>
-      <w:tr>
-        <w:tc>
-          <w:tcPr>
-            <w:tcW w:type="dxa" w:w="1900"/>
-            <w:vMerge/>
-          </w:tcPr>
-          <w:p/>
-        </w:tc>
-        <w:tc>
-          <w:tcPr>
-            <w:tcW w:type="dxa" w:w="600"/>
-          </w:tcPr>
-          <w:p/>
-        </w:tc>
-        <w:tc>
-          <w:tcPr>
-            <w:tcW w:type="dxa" w:w="2300"/>
-          </w:tcPr>
-          <w:p/>
-        </w:tc>
-        <w:tc>
-          <w:tcPr>
-            <w:tcW w:type="dxa" w:w="4500"/>
-          </w:tcPr>
-          <w:p>
-            <w:pPr>
-              <w:spacing w:after="0"/>
-            </w:pPr>
-            <w:r/>
-            <w:r>
-              <w:rPr>
-                <w:rFonts w:ascii="Calibri" w:hAnsi="Calibri"/>
-                <w:sz w:val="21"/>
-              </w:rPr>
-              <w:t>Check if the email is already used</w:t>
-            </w:r>
-          </w:p>
-          <w:p>
-            <w:pPr>
-              <w:spacing w:after="0"/>
-            </w:pPr>
-            <w:r>
-              <w:rPr>
-                <w:rFonts w:ascii="Calibri" w:hAnsi="Calibri"/>
-                <w:sz w:val="21"/>
-              </w:rPr>
-              <w:t>In Profile, enter an email another account uses</w:t>
-            </w:r>
-          </w:p>
-        </w:tc>
-        <w:tc>
-          <w:tcPr>
-            <w:tcW w:type="dxa" w:w="4700"/>
-          </w:tcPr>
-          <w:p>
-            <w:pPr>
-              <w:spacing w:after="0"/>
-            </w:pPr>
-            <w:r/>
-            <w:r>
-              <w:rPr>
-                <w:rFonts w:ascii="Calibri" w:hAnsi="Calibri"/>
-                <w:sz w:val="21"/>
-              </w:rPr>
-              <w:t>A message "That email is already used by another account" is displayed</w:t>
             </w:r>
           </w:p>
         </w:tc>
@@ -5258,19 +2678,7 @@
                 <w:rFonts w:ascii="Calibri" w:hAnsi="Calibri"/>
                 <w:sz w:val="21"/>
               </w:rPr>
-              <w:t>Check if the password is changed</w:t>
-            </w:r>
-          </w:p>
-          <w:p>
-            <w:pPr>
-              <w:spacing w:after="0"/>
-            </w:pPr>
-            <w:r>
-              <w:rPr>
-                <w:rFonts w:ascii="Calibri" w:hAnsi="Calibri"/>
-                <w:sz w:val="21"/>
-              </w:rPr>
-              <w:t>In Password, enter the current password and the same new password twice, then click Update password</w:t>
+              <w:t>Check if the password is changed: in Password, enter the current password and the same new password twice, then click Update password</w:t>
             </w:r>
           </w:p>
         </w:tc>
@@ -5512,106 +2920,7 @@
                 <w:rFonts w:ascii="Calibri" w:hAnsi="Calibri"/>
                 <w:sz w:val="21"/>
               </w:rPr>
-              <w:t>Check if an order is confirmed</w:t>
-            </w:r>
-          </w:p>
-          <w:p>
-            <w:pPr>
-              <w:spacing w:after="0"/>
-            </w:pPr>
-            <w:r>
-              <w:rPr>
-                <w:rFonts w:ascii="Calibri" w:hAnsi="Calibri"/>
-                <w:sz w:val="21"/>
-              </w:rPr>
-              <w:t>Click Confirm order on a waiting order, choose the delivery date, then click Confirm order</w:t>
-            </w:r>
-          </w:p>
-        </w:tc>
-        <w:tc>
-          <w:tcPr>
-            <w:tcW w:type="dxa" w:w="4700"/>
-          </w:tcPr>
-          <w:p>
-            <w:pPr>
-              <w:spacing w:after="0"/>
-            </w:pPr>
-            <w:r/>
-            <w:r>
-              <w:rPr>
-                <w:rFonts w:ascii="Calibri" w:hAnsi="Calibri"/>
-                <w:sz w:val="21"/>
-              </w:rPr>
-              <w:t>A message "Order confirmed." is displayed</w:t>
-            </w:r>
-          </w:p>
-        </w:tc>
-        <w:tc>
-          <w:tcPr>
-            <w:tcW w:type="dxa" w:w="2100"/>
-          </w:tcPr>
-          <w:p/>
-        </w:tc>
-        <w:tc>
-          <w:tcPr>
-            <w:tcW w:type="dxa" w:w="1520"/>
-          </w:tcPr>
-          <w:p/>
-        </w:tc>
-        <w:tc>
-          <w:tcPr>
-            <w:tcW w:type="dxa" w:w="1100"/>
-          </w:tcPr>
-          <w:p/>
-        </w:tc>
-      </w:tr>
-      <w:tr>
-        <w:tc>
-          <w:tcPr>
-            <w:tcW w:type="dxa" w:w="1900"/>
-            <w:vMerge/>
-          </w:tcPr>
-          <w:p/>
-        </w:tc>
-        <w:tc>
-          <w:tcPr>
-            <w:tcW w:type="dxa" w:w="600"/>
-          </w:tcPr>
-          <w:p/>
-        </w:tc>
-        <w:tc>
-          <w:tcPr>
-            <w:tcW w:type="dxa" w:w="2300"/>
-          </w:tcPr>
-          <w:p/>
-        </w:tc>
-        <w:tc>
-          <w:tcPr>
-            <w:tcW w:type="dxa" w:w="4500"/>
-          </w:tcPr>
-          <w:p>
-            <w:pPr>
-              <w:spacing w:after="0"/>
-            </w:pPr>
-            <w:r/>
-            <w:r>
-              <w:rPr>
-                <w:rFonts w:ascii="Calibri" w:hAnsi="Calibri"/>
-                <w:sz w:val="21"/>
-              </w:rPr>
-              <w:t>Check if the delivery date is empty</w:t>
-            </w:r>
-          </w:p>
-          <w:p>
-            <w:pPr>
-              <w:spacing w:after="0"/>
-            </w:pPr>
-            <w:r>
-              <w:rPr>
-                <w:rFonts w:ascii="Calibri" w:hAnsi="Calibri"/>
-                <w:sz w:val="21"/>
-              </w:rPr>
-              <w:t>Click Confirm order and leave the delivery date empty</w:t>
+              <w:t>Check if the delivery date is empty: click Confirm order and leave the delivery date empty</w:t>
             </w:r>
           </w:p>
         </w:tc>
@@ -5630,441 +2939,6 @@
                 <w:sz w:val="21"/>
               </w:rPr>
               <w:t>A message "Choose the date you will deliver" is displayed</w:t>
-            </w:r>
-          </w:p>
-        </w:tc>
-        <w:tc>
-          <w:tcPr>
-            <w:tcW w:type="dxa" w:w="2100"/>
-          </w:tcPr>
-          <w:p/>
-        </w:tc>
-        <w:tc>
-          <w:tcPr>
-            <w:tcW w:type="dxa" w:w="1520"/>
-          </w:tcPr>
-          <w:p/>
-        </w:tc>
-        <w:tc>
-          <w:tcPr>
-            <w:tcW w:type="dxa" w:w="1100"/>
-          </w:tcPr>
-          <w:p/>
-        </w:tc>
-      </w:tr>
-      <w:tr>
-        <w:tc>
-          <w:tcPr>
-            <w:tcW w:type="dxa" w:w="1900"/>
-            <w:vMerge/>
-          </w:tcPr>
-          <w:p/>
-        </w:tc>
-        <w:tc>
-          <w:tcPr>
-            <w:tcW w:type="dxa" w:w="600"/>
-          </w:tcPr>
-          <w:p/>
-        </w:tc>
-        <w:tc>
-          <w:tcPr>
-            <w:tcW w:type="dxa" w:w="2300"/>
-          </w:tcPr>
-          <w:p/>
-        </w:tc>
-        <w:tc>
-          <w:tcPr>
-            <w:tcW w:type="dxa" w:w="4500"/>
-          </w:tcPr>
-          <w:p>
-            <w:pPr>
-              <w:spacing w:after="0"/>
-            </w:pPr>
-            <w:r/>
-            <w:r>
-              <w:rPr>
-                <w:rFonts w:ascii="Calibri" w:hAnsi="Calibri"/>
-                <w:sz w:val="21"/>
-              </w:rPr>
-              <w:t>Check if the new delivery date is empty</w:t>
-            </w:r>
-          </w:p>
-          <w:p>
-            <w:pPr>
-              <w:spacing w:after="0"/>
-            </w:pPr>
-            <w:r>
-              <w:rPr>
-                <w:rFonts w:ascii="Calibri" w:hAnsi="Calibri"/>
-                <w:sz w:val="21"/>
-              </w:rPr>
-              <w:t>Click Change delivery date and leave the new date empty, then click Save new date</w:t>
-            </w:r>
-          </w:p>
-        </w:tc>
-        <w:tc>
-          <w:tcPr>
-            <w:tcW w:type="dxa" w:w="4700"/>
-          </w:tcPr>
-          <w:p>
-            <w:pPr>
-              <w:spacing w:after="0"/>
-            </w:pPr>
-            <w:r/>
-            <w:r>
-              <w:rPr>
-                <w:rFonts w:ascii="Calibri" w:hAnsi="Calibri"/>
-                <w:sz w:val="21"/>
-              </w:rPr>
-              <w:t>A message "Choose the new delivery date" is displayed</w:t>
-            </w:r>
-          </w:p>
-        </w:tc>
-        <w:tc>
-          <w:tcPr>
-            <w:tcW w:type="dxa" w:w="2100"/>
-          </w:tcPr>
-          <w:p/>
-        </w:tc>
-        <w:tc>
-          <w:tcPr>
-            <w:tcW w:type="dxa" w:w="1520"/>
-          </w:tcPr>
-          <w:p/>
-        </w:tc>
-        <w:tc>
-          <w:tcPr>
-            <w:tcW w:type="dxa" w:w="1100"/>
-          </w:tcPr>
-          <w:p/>
-        </w:tc>
-      </w:tr>
-      <w:tr>
-        <w:tc>
-          <w:tcPr>
-            <w:tcW w:type="dxa" w:w="1900"/>
-            <w:vMerge/>
-          </w:tcPr>
-          <w:p/>
-        </w:tc>
-        <w:tc>
-          <w:tcPr>
-            <w:tcW w:type="dxa" w:w="600"/>
-          </w:tcPr>
-          <w:p/>
-        </w:tc>
-        <w:tc>
-          <w:tcPr>
-            <w:tcW w:type="dxa" w:w="2300"/>
-          </w:tcPr>
-          <w:p/>
-        </w:tc>
-        <w:tc>
-          <w:tcPr>
-            <w:tcW w:type="dxa" w:w="4500"/>
-          </w:tcPr>
-          <w:p>
-            <w:pPr>
-              <w:spacing w:after="0"/>
-            </w:pPr>
-            <w:r/>
-            <w:r>
-              <w:rPr>
-                <w:rFonts w:ascii="Calibri" w:hAnsi="Calibri"/>
-                <w:sz w:val="21"/>
-              </w:rPr>
-              <w:t>Check if the reason for the new date is empty</w:t>
-            </w:r>
-          </w:p>
-          <w:p>
-            <w:pPr>
-              <w:spacing w:after="0"/>
-            </w:pPr>
-            <w:r>
-              <w:rPr>
-                <w:rFonts w:ascii="Calibri" w:hAnsi="Calibri"/>
-                <w:sz w:val="21"/>
-              </w:rPr>
-              <w:t>Enter the new date but leave the reason empty, then click Save new date</w:t>
-            </w:r>
-          </w:p>
-        </w:tc>
-        <w:tc>
-          <w:tcPr>
-            <w:tcW w:type="dxa" w:w="4700"/>
-          </w:tcPr>
-          <w:p>
-            <w:pPr>
-              <w:spacing w:after="0"/>
-            </w:pPr>
-            <w:r/>
-            <w:r>
-              <w:rPr>
-                <w:rFonts w:ascii="Calibri" w:hAnsi="Calibri"/>
-                <w:sz w:val="21"/>
-              </w:rPr>
-              <w:t>A message "Say briefly why the date changed" is displayed</w:t>
-            </w:r>
-          </w:p>
-        </w:tc>
-        <w:tc>
-          <w:tcPr>
-            <w:tcW w:type="dxa" w:w="2100"/>
-          </w:tcPr>
-          <w:p/>
-        </w:tc>
-        <w:tc>
-          <w:tcPr>
-            <w:tcW w:type="dxa" w:w="1520"/>
-          </w:tcPr>
-          <w:p/>
-        </w:tc>
-        <w:tc>
-          <w:tcPr>
-            <w:tcW w:type="dxa" w:w="1100"/>
-          </w:tcPr>
-          <w:p/>
-        </w:tc>
-      </w:tr>
-      <w:tr>
-        <w:tc>
-          <w:tcPr>
-            <w:tcW w:type="dxa" w:w="1900"/>
-            <w:vMerge/>
-          </w:tcPr>
-          <w:p/>
-        </w:tc>
-        <w:tc>
-          <w:tcPr>
-            <w:tcW w:type="dxa" w:w="600"/>
-          </w:tcPr>
-          <w:p/>
-        </w:tc>
-        <w:tc>
-          <w:tcPr>
-            <w:tcW w:type="dxa" w:w="2300"/>
-          </w:tcPr>
-          <w:p/>
-        </w:tc>
-        <w:tc>
-          <w:tcPr>
-            <w:tcW w:type="dxa" w:w="4500"/>
-          </w:tcPr>
-          <w:p>
-            <w:pPr>
-              <w:spacing w:after="0"/>
-            </w:pPr>
-            <w:r/>
-            <w:r>
-              <w:rPr>
-                <w:rFonts w:ascii="Calibri" w:hAnsi="Calibri"/>
-                <w:sz w:val="21"/>
-              </w:rPr>
-              <w:t>Check if the offer has no quantity</w:t>
-            </w:r>
-          </w:p>
-          <w:p>
-            <w:pPr>
-              <w:spacing w:after="0"/>
-            </w:pPr>
-            <w:r>
-              <w:rPr>
-                <w:rFonts w:ascii="Calibri" w:hAnsi="Calibri"/>
-                <w:sz w:val="21"/>
-              </w:rPr>
-              <w:t>Click Offer an order without entering any quantity, then click Send offer</w:t>
-            </w:r>
-          </w:p>
-        </w:tc>
-        <w:tc>
-          <w:tcPr>
-            <w:tcW w:type="dxa" w:w="4700"/>
-          </w:tcPr>
-          <w:p>
-            <w:pPr>
-              <w:spacing w:after="0"/>
-            </w:pPr>
-            <w:r/>
-            <w:r>
-              <w:rPr>
-                <w:rFonts w:ascii="Calibri" w:hAnsi="Calibri"/>
-                <w:sz w:val="21"/>
-              </w:rPr>
-              <w:t>A message "Enter a quantity for at least one product" is displayed</w:t>
-            </w:r>
-          </w:p>
-        </w:tc>
-        <w:tc>
-          <w:tcPr>
-            <w:tcW w:type="dxa" w:w="2100"/>
-          </w:tcPr>
-          <w:p/>
-        </w:tc>
-        <w:tc>
-          <w:tcPr>
-            <w:tcW w:type="dxa" w:w="1520"/>
-          </w:tcPr>
-          <w:p/>
-        </w:tc>
-        <w:tc>
-          <w:tcPr>
-            <w:tcW w:type="dxa" w:w="1100"/>
-          </w:tcPr>
-          <w:p/>
-        </w:tc>
-      </w:tr>
-      <w:tr>
-        <w:tc>
-          <w:tcPr>
-            <w:tcW w:type="dxa" w:w="1900"/>
-            <w:vMerge/>
-          </w:tcPr>
-          <w:p/>
-        </w:tc>
-        <w:tc>
-          <w:tcPr>
-            <w:tcW w:type="dxa" w:w="600"/>
-          </w:tcPr>
-          <w:p/>
-        </w:tc>
-        <w:tc>
-          <w:tcPr>
-            <w:tcW w:type="dxa" w:w="2300"/>
-          </w:tcPr>
-          <w:p/>
-        </w:tc>
-        <w:tc>
-          <w:tcPr>
-            <w:tcW w:type="dxa" w:w="4500"/>
-          </w:tcPr>
-          <w:p>
-            <w:pPr>
-              <w:spacing w:after="0"/>
-            </w:pPr>
-            <w:r/>
-            <w:r>
-              <w:rPr>
-                <w:rFonts w:ascii="Calibri" w:hAnsi="Calibri"/>
-                <w:sz w:val="21"/>
-              </w:rPr>
-              <w:t>Check if the offer's delivery date is empty</w:t>
-            </w:r>
-          </w:p>
-          <w:p>
-            <w:pPr>
-              <w:spacing w:after="0"/>
-            </w:pPr>
-            <w:r>
-              <w:rPr>
-                <w:rFonts w:ascii="Calibri" w:hAnsi="Calibri"/>
-                <w:sz w:val="21"/>
-              </w:rPr>
-              <w:t>Enter a quantity but leave the delivery date empty, then click Send offer</w:t>
-            </w:r>
-          </w:p>
-        </w:tc>
-        <w:tc>
-          <w:tcPr>
-            <w:tcW w:type="dxa" w:w="4700"/>
-          </w:tcPr>
-          <w:p>
-            <w:pPr>
-              <w:spacing w:after="0"/>
-            </w:pPr>
-            <w:r/>
-            <w:r>
-              <w:rPr>
-                <w:rFonts w:ascii="Calibri" w:hAnsi="Calibri"/>
-                <w:sz w:val="21"/>
-              </w:rPr>
-              <w:t>A message "Choose the date you could deliver" is displayed</w:t>
-            </w:r>
-          </w:p>
-        </w:tc>
-        <w:tc>
-          <w:tcPr>
-            <w:tcW w:type="dxa" w:w="2100"/>
-          </w:tcPr>
-          <w:p/>
-        </w:tc>
-        <w:tc>
-          <w:tcPr>
-            <w:tcW w:type="dxa" w:w="1520"/>
-          </w:tcPr>
-          <w:p/>
-        </w:tc>
-        <w:tc>
-          <w:tcPr>
-            <w:tcW w:type="dxa" w:w="1100"/>
-          </w:tcPr>
-          <w:p/>
-        </w:tc>
-      </w:tr>
-      <w:tr>
-        <w:tc>
-          <w:tcPr>
-            <w:tcW w:type="dxa" w:w="1900"/>
-            <w:vMerge/>
-          </w:tcPr>
-          <w:p/>
-        </w:tc>
-        <w:tc>
-          <w:tcPr>
-            <w:tcW w:type="dxa" w:w="600"/>
-          </w:tcPr>
-          <w:p/>
-        </w:tc>
-        <w:tc>
-          <w:tcPr>
-            <w:tcW w:type="dxa" w:w="2300"/>
-          </w:tcPr>
-          <w:p/>
-        </w:tc>
-        <w:tc>
-          <w:tcPr>
-            <w:tcW w:type="dxa" w:w="4500"/>
-          </w:tcPr>
-          <w:p>
-            <w:pPr>
-              <w:spacing w:after="0"/>
-            </w:pPr>
-            <w:r/>
-            <w:r>
-              <w:rPr>
-                <w:rFonts w:ascii="Calibri" w:hAnsi="Calibri"/>
-                <w:sz w:val="21"/>
-              </w:rPr>
-              <w:t>Check if the note is empty</w:t>
-            </w:r>
-          </w:p>
-          <w:p>
-            <w:pPr>
-              <w:spacing w:after="0"/>
-            </w:pPr>
-            <w:r>
-              <w:rPr>
-                <w:rFonts w:ascii="Calibri" w:hAnsi="Calibri"/>
-                <w:sz w:val="21"/>
-              </w:rPr>
-              <w:t>Click Notes and click Send with the note empty</w:t>
-            </w:r>
-          </w:p>
-        </w:tc>
-        <w:tc>
-          <w:tcPr>
-            <w:tcW w:type="dxa" w:w="4700"/>
-          </w:tcPr>
-          <w:p>
-            <w:pPr>
-              <w:spacing w:after="0"/>
-            </w:pPr>
-            <w:r/>
-            <w:r>
-              <w:rPr>
-                <w:rFonts w:ascii="Calibri" w:hAnsi="Calibri"/>
-                <w:sz w:val="21"/>
-              </w:rPr>
-              <w:t>A tooltip "Please fill out this field." is displayed</w:t>
             </w:r>
           </w:p>
         </w:tc>
@@ -6204,106 +3078,7 @@
                 <w:rFonts w:ascii="Calibri" w:hAnsi="Calibri"/>
                 <w:sz w:val="21"/>
               </w:rPr>
-              <w:t>Check if a correct receipt number is accepted</w:t>
-            </w:r>
-          </w:p>
-          <w:p>
-            <w:pPr>
-              <w:spacing w:after="0"/>
-            </w:pPr>
-            <w:r>
-              <w:rPr>
-                <w:rFonts w:ascii="Calibri" w:hAnsi="Calibri"/>
-                <w:sz w:val="21"/>
-              </w:rPr>
-              <w:t>Click Mark as shipped, enter a receipt number with letters and numbers, then click Mark as shipped</w:t>
-            </w:r>
-          </w:p>
-        </w:tc>
-        <w:tc>
-          <w:tcPr>
-            <w:tcW w:type="dxa" w:w="4700"/>
-          </w:tcPr>
-          <w:p>
-            <w:pPr>
-              <w:spacing w:after="0"/>
-            </w:pPr>
-            <w:r/>
-            <w:r>
-              <w:rPr>
-                <w:rFonts w:ascii="Calibri" w:hAnsi="Calibri"/>
-                <w:sz w:val="21"/>
-              </w:rPr>
-              <w:t>A message "Order marked as shipped." is displayed</w:t>
-            </w:r>
-          </w:p>
-        </w:tc>
-        <w:tc>
-          <w:tcPr>
-            <w:tcW w:type="dxa" w:w="2100"/>
-          </w:tcPr>
-          <w:p/>
-        </w:tc>
-        <w:tc>
-          <w:tcPr>
-            <w:tcW w:type="dxa" w:w="1520"/>
-          </w:tcPr>
-          <w:p/>
-        </w:tc>
-        <w:tc>
-          <w:tcPr>
-            <w:tcW w:type="dxa" w:w="1100"/>
-          </w:tcPr>
-          <w:p/>
-        </w:tc>
-      </w:tr>
-      <w:tr>
-        <w:tc>
-          <w:tcPr>
-            <w:tcW w:type="dxa" w:w="1900"/>
-            <w:vMerge/>
-          </w:tcPr>
-          <w:p/>
-        </w:tc>
-        <w:tc>
-          <w:tcPr>
-            <w:tcW w:type="dxa" w:w="600"/>
-          </w:tcPr>
-          <w:p/>
-        </w:tc>
-        <w:tc>
-          <w:tcPr>
-            <w:tcW w:type="dxa" w:w="2300"/>
-          </w:tcPr>
-          <w:p/>
-        </w:tc>
-        <w:tc>
-          <w:tcPr>
-            <w:tcW w:type="dxa" w:w="4500"/>
-          </w:tcPr>
-          <w:p>
-            <w:pPr>
-              <w:spacing w:after="0"/>
-            </w:pPr>
-            <w:r/>
-            <w:r>
-              <w:rPr>
-                <w:rFonts w:ascii="Calibri" w:hAnsi="Calibri"/>
-                <w:sz w:val="21"/>
-              </w:rPr>
-              <w:t>Check if the receipt number has * or @</w:t>
-            </w:r>
-          </w:p>
-          <w:p>
-            <w:pPr>
-              <w:spacing w:after="0"/>
-            </w:pPr>
-            <w:r>
-              <w:rPr>
-                <w:rFonts w:ascii="Calibri" w:hAnsi="Calibri"/>
-                <w:sz w:val="21"/>
-              </w:rPr>
-              <w:t>Enter a receipt number with * or @</w:t>
+              <w:t>Check if the receipt number has * or @: enter a receipt number with * or @</w:t>
             </w:r>
           </w:p>
         </w:tc>
@@ -6322,93 +3097,6 @@
                 <w:sz w:val="21"/>
               </w:rPr>
               <w:t>A message "The receipt number can use letters, numbers, spaces and . / # _ - only." is displayed</w:t>
-            </w:r>
-          </w:p>
-        </w:tc>
-        <w:tc>
-          <w:tcPr>
-            <w:tcW w:type="dxa" w:w="2100"/>
-          </w:tcPr>
-          <w:p/>
-        </w:tc>
-        <w:tc>
-          <w:tcPr>
-            <w:tcW w:type="dxa" w:w="1520"/>
-          </w:tcPr>
-          <w:p/>
-        </w:tc>
-        <w:tc>
-          <w:tcPr>
-            <w:tcW w:type="dxa" w:w="1100"/>
-          </w:tcPr>
-          <w:p/>
-        </w:tc>
-      </w:tr>
-      <w:tr>
-        <w:tc>
-          <w:tcPr>
-            <w:tcW w:type="dxa" w:w="1900"/>
-            <w:vMerge/>
-          </w:tcPr>
-          <w:p/>
-        </w:tc>
-        <w:tc>
-          <w:tcPr>
-            <w:tcW w:type="dxa" w:w="600"/>
-          </w:tcPr>
-          <w:p/>
-        </w:tc>
-        <w:tc>
-          <w:tcPr>
-            <w:tcW w:type="dxa" w:w="2300"/>
-          </w:tcPr>
-          <w:p/>
-        </w:tc>
-        <w:tc>
-          <w:tcPr>
-            <w:tcW w:type="dxa" w:w="4500"/>
-          </w:tcPr>
-          <w:p>
-            <w:pPr>
-              <w:spacing w:after="0"/>
-            </w:pPr>
-            <w:r/>
-            <w:r>
-              <w:rPr>
-                <w:rFonts w:ascii="Calibri" w:hAnsi="Calibri"/>
-                <w:sz w:val="21"/>
-              </w:rPr>
-              <w:t>Check if the phone number has letters</w:t>
-            </w:r>
-          </w:p>
-          <w:p>
-            <w:pPr>
-              <w:spacing w:after="0"/>
-            </w:pPr>
-            <w:r>
-              <w:rPr>
-                <w:rFonts w:ascii="Calibri" w:hAnsi="Calibri"/>
-                <w:sz w:val="21"/>
-              </w:rPr>
-              <w:t>Click Edit contact details and enter a phone number with letters, then click Save details</w:t>
-            </w:r>
-          </w:p>
-        </w:tc>
-        <w:tc>
-          <w:tcPr>
-            <w:tcW w:type="dxa" w:w="4700"/>
-          </w:tcPr>
-          <w:p>
-            <w:pPr>
-              <w:spacing w:after="0"/>
-            </w:pPr>
-            <w:r/>
-            <w:r>
-              <w:rPr>
-                <w:rFonts w:ascii="Calibri" w:hAnsi="Calibri"/>
-                <w:sz w:val="21"/>
-              </w:rPr>
-              <w:t>A message "Enter a phone number using digits, spaces and + ( ) - only." is displayed</w:t>
             </w:r>
           </w:p>
         </w:tc>
@@ -6548,193 +3236,7 @@
                 <w:rFonts w:ascii="Calibri" w:hAnsi="Calibri"/>
                 <w:sz w:val="21"/>
               </w:rPr>
-              <w:t>Check if a price above zero is sent</w:t>
-            </w:r>
-          </w:p>
-          <w:p>
-            <w:pPr>
-              <w:spacing w:after="0"/>
-            </w:pPr>
-            <w:r>
-              <w:rPr>
-                <w:rFonts w:ascii="Calibri" w:hAnsi="Calibri"/>
-                <w:sz w:val="21"/>
-              </w:rPr>
-              <w:t>Click Change price, enter a New price greater than zero, then click Send to the shop</w:t>
-            </w:r>
-          </w:p>
-        </w:tc>
-        <w:tc>
-          <w:tcPr>
-            <w:tcW w:type="dxa" w:w="4700"/>
-          </w:tcPr>
-          <w:p>
-            <w:pPr>
-              <w:spacing w:after="0"/>
-            </w:pPr>
-            <w:r/>
-            <w:r>
-              <w:rPr>
-                <w:rFonts w:ascii="Calibri" w:hAnsi="Calibri"/>
-                <w:sz w:val="21"/>
-              </w:rPr>
-              <w:t>A message "Sent to the shop for approval. The current price stays until they agree." is displayed</w:t>
-            </w:r>
-          </w:p>
-        </w:tc>
-        <w:tc>
-          <w:tcPr>
-            <w:tcW w:type="dxa" w:w="2100"/>
-          </w:tcPr>
-          <w:p/>
-        </w:tc>
-        <w:tc>
-          <w:tcPr>
-            <w:tcW w:type="dxa" w:w="1520"/>
-          </w:tcPr>
-          <w:p/>
-        </w:tc>
-        <w:tc>
-          <w:tcPr>
-            <w:tcW w:type="dxa" w:w="1100"/>
-          </w:tcPr>
-          <w:p/>
-        </w:tc>
-      </w:tr>
-      <w:tr>
-        <w:tc>
-          <w:tcPr>
-            <w:tcW w:type="dxa" w:w="1900"/>
-            <w:vMerge/>
-          </w:tcPr>
-          <w:p/>
-        </w:tc>
-        <w:tc>
-          <w:tcPr>
-            <w:tcW w:type="dxa" w:w="600"/>
-          </w:tcPr>
-          <w:p/>
-        </w:tc>
-        <w:tc>
-          <w:tcPr>
-            <w:tcW w:type="dxa" w:w="2300"/>
-          </w:tcPr>
-          <w:p/>
-        </w:tc>
-        <w:tc>
-          <w:tcPr>
-            <w:tcW w:type="dxa" w:w="4500"/>
-          </w:tcPr>
-          <w:p>
-            <w:pPr>
-              <w:spacing w:after="0"/>
-            </w:pPr>
-            <w:r/>
-            <w:r>
-              <w:rPr>
-                <w:rFonts w:ascii="Calibri" w:hAnsi="Calibri"/>
-                <w:sz w:val="21"/>
-              </w:rPr>
-              <w:t>Check if the price is 0</w:t>
-            </w:r>
-          </w:p>
-          <w:p>
-            <w:pPr>
-              <w:spacing w:after="0"/>
-            </w:pPr>
-            <w:r>
-              <w:rPr>
-                <w:rFonts w:ascii="Calibri" w:hAnsi="Calibri"/>
-                <w:sz w:val="21"/>
-              </w:rPr>
-              <w:t>Click Change price and enter 0</w:t>
-            </w:r>
-          </w:p>
-        </w:tc>
-        <w:tc>
-          <w:tcPr>
-            <w:tcW w:type="dxa" w:w="4700"/>
-          </w:tcPr>
-          <w:p>
-            <w:pPr>
-              <w:spacing w:after="0"/>
-            </w:pPr>
-            <w:r/>
-            <w:r>
-              <w:rPr>
-                <w:rFonts w:ascii="Calibri" w:hAnsi="Calibri"/>
-                <w:sz w:val="21"/>
-              </w:rPr>
-              <w:t>A message "Enter a price greater than zero" is displayed</w:t>
-            </w:r>
-          </w:p>
-        </w:tc>
-        <w:tc>
-          <w:tcPr>
-            <w:tcW w:type="dxa" w:w="2100"/>
-          </w:tcPr>
-          <w:p/>
-        </w:tc>
-        <w:tc>
-          <w:tcPr>
-            <w:tcW w:type="dxa" w:w="1520"/>
-          </w:tcPr>
-          <w:p/>
-        </w:tc>
-        <w:tc>
-          <w:tcPr>
-            <w:tcW w:type="dxa" w:w="1100"/>
-          </w:tcPr>
-          <w:p/>
-        </w:tc>
-      </w:tr>
-      <w:tr>
-        <w:tc>
-          <w:tcPr>
-            <w:tcW w:type="dxa" w:w="1900"/>
-            <w:vMerge/>
-          </w:tcPr>
-          <w:p/>
-        </w:tc>
-        <w:tc>
-          <w:tcPr>
-            <w:tcW w:type="dxa" w:w="600"/>
-          </w:tcPr>
-          <w:p/>
-        </w:tc>
-        <w:tc>
-          <w:tcPr>
-            <w:tcW w:type="dxa" w:w="2300"/>
-          </w:tcPr>
-          <w:p/>
-        </w:tc>
-        <w:tc>
-          <w:tcPr>
-            <w:tcW w:type="dxa" w:w="4500"/>
-          </w:tcPr>
-          <w:p>
-            <w:pPr>
-              <w:spacing w:after="0"/>
-            </w:pPr>
-            <w:r/>
-            <w:r>
-              <w:rPr>
-                <w:rFonts w:ascii="Calibri" w:hAnsi="Calibri"/>
-                <w:sz w:val="21"/>
-              </w:rPr>
-              <w:t>Check if the delivery date is in the past</w:t>
-            </w:r>
-          </w:p>
-          <w:p>
-            <w:pPr>
-              <w:spacing w:after="0"/>
-            </w:pPr>
-            <w:r>
-              <w:rPr>
-                <w:rFonts w:ascii="Calibri" w:hAnsi="Calibri"/>
-                <w:sz w:val="21"/>
-              </w:rPr>
-              <w:t>Click Confirm order and type a delivery date in the past</w:t>
+              <w:t>Check if the delivery date is in the past: click Confirm order and type a delivery date in the past</w:t>
             </w:r>
           </w:p>
         </w:tc>
@@ -6753,180 +3255,6 @@
                 <w:sz w:val="21"/>
               </w:rPr>
               <w:t>A message "The delivery date cannot be in the past." is displayed</w:t>
-            </w:r>
-          </w:p>
-        </w:tc>
-        <w:tc>
-          <w:tcPr>
-            <w:tcW w:type="dxa" w:w="2100"/>
-          </w:tcPr>
-          <w:p/>
-        </w:tc>
-        <w:tc>
-          <w:tcPr>
-            <w:tcW w:type="dxa" w:w="1520"/>
-          </w:tcPr>
-          <w:p/>
-        </w:tc>
-        <w:tc>
-          <w:tcPr>
-            <w:tcW w:type="dxa" w:w="1100"/>
-          </w:tcPr>
-          <w:p/>
-        </w:tc>
-      </w:tr>
-      <w:tr>
-        <w:tc>
-          <w:tcPr>
-            <w:tcW w:type="dxa" w:w="1900"/>
-            <w:vMerge/>
-          </w:tcPr>
-          <w:p/>
-        </w:tc>
-        <w:tc>
-          <w:tcPr>
-            <w:tcW w:type="dxa" w:w="600"/>
-          </w:tcPr>
-          <w:p/>
-        </w:tc>
-        <w:tc>
-          <w:tcPr>
-            <w:tcW w:type="dxa" w:w="2300"/>
-          </w:tcPr>
-          <w:p/>
-        </w:tc>
-        <w:tc>
-          <w:tcPr>
-            <w:tcW w:type="dxa" w:w="4500"/>
-          </w:tcPr>
-          <w:p>
-            <w:pPr>
-              <w:spacing w:after="0"/>
-            </w:pPr>
-            <w:r/>
-            <w:r>
-              <w:rPr>
-                <w:rFonts w:ascii="Calibri" w:hAnsi="Calibri"/>
-                <w:sz w:val="21"/>
-              </w:rPr>
-              <w:t>Check if the delivery date is over a year away</w:t>
-            </w:r>
-          </w:p>
-          <w:p>
-            <w:pPr>
-              <w:spacing w:after="0"/>
-            </w:pPr>
-            <w:r>
-              <w:rPr>
-                <w:rFonts w:ascii="Calibri" w:hAnsi="Calibri"/>
-                <w:sz w:val="21"/>
-              </w:rPr>
-              <w:t>Click Confirm order and choose a date more than a year away</w:t>
-            </w:r>
-          </w:p>
-        </w:tc>
-        <w:tc>
-          <w:tcPr>
-            <w:tcW w:type="dxa" w:w="4700"/>
-          </w:tcPr>
-          <w:p>
-            <w:pPr>
-              <w:spacing w:after="0"/>
-            </w:pPr>
-            <w:r/>
-            <w:r>
-              <w:rPr>
-                <w:rFonts w:ascii="Calibri" w:hAnsi="Calibri"/>
-                <w:sz w:val="21"/>
-              </w:rPr>
-              <w:t>A message "That delivery date is more than a year away." is displayed</w:t>
-            </w:r>
-          </w:p>
-        </w:tc>
-        <w:tc>
-          <w:tcPr>
-            <w:tcW w:type="dxa" w:w="2100"/>
-          </w:tcPr>
-          <w:p/>
-        </w:tc>
-        <w:tc>
-          <w:tcPr>
-            <w:tcW w:type="dxa" w:w="1520"/>
-          </w:tcPr>
-          <w:p/>
-        </w:tc>
-        <w:tc>
-          <w:tcPr>
-            <w:tcW w:type="dxa" w:w="1100"/>
-          </w:tcPr>
-          <w:p/>
-        </w:tc>
-      </w:tr>
-      <w:tr>
-        <w:tc>
-          <w:tcPr>
-            <w:tcW w:type="dxa" w:w="1900"/>
-            <w:vMerge/>
-          </w:tcPr>
-          <w:p/>
-        </w:tc>
-        <w:tc>
-          <w:tcPr>
-            <w:tcW w:type="dxa" w:w="600"/>
-          </w:tcPr>
-          <w:p/>
-        </w:tc>
-        <w:tc>
-          <w:tcPr>
-            <w:tcW w:type="dxa" w:w="2300"/>
-          </w:tcPr>
-          <w:p/>
-        </w:tc>
-        <w:tc>
-          <w:tcPr>
-            <w:tcW w:type="dxa" w:w="4500"/>
-          </w:tcPr>
-          <w:p>
-            <w:pPr>
-              <w:spacing w:after="0"/>
-            </w:pPr>
-            <w:r/>
-            <w:r>
-              <w:rPr>
-                <w:rFonts w:ascii="Calibri" w:hAnsi="Calibri"/>
-                <w:sz w:val="21"/>
-              </w:rPr>
-              <w:t>Check if 5 offers are already waiting</w:t>
-            </w:r>
-          </w:p>
-          <w:p>
-            <w:pPr>
-              <w:spacing w:after="0"/>
-            </w:pPr>
-            <w:r>
-              <w:rPr>
-                <w:rFonts w:ascii="Calibri" w:hAnsi="Calibri"/>
-                <w:sz w:val="21"/>
-              </w:rPr>
-              <w:t>Click Offer an order when 5 offers are already waiting</w:t>
-            </w:r>
-          </w:p>
-        </w:tc>
-        <w:tc>
-          <w:tcPr>
-            <w:tcW w:type="dxa" w:w="4700"/>
-          </w:tcPr>
-          <w:p>
-            <w:pPr>
-              <w:spacing w:after="0"/>
-            </w:pPr>
-            <w:r/>
-            <w:r>
-              <w:rPr>
-                <w:rFonts w:ascii="Calibri" w:hAnsi="Calibri"/>
-                <w:sz w:val="21"/>
-              </w:rPr>
-              <w:t>A message "You already have 5 offers waiting for the shop. Wait for an answer before sending more." is displayed</w:t>
             </w:r>
           </w:p>
         </w:tc>
@@ -7066,193 +3394,7 @@
                 <w:rFonts w:ascii="Calibri" w:hAnsi="Calibri"/>
                 <w:sz w:val="21"/>
               </w:rPr>
-              <w:t>Check if the portal lists only this supplier's orders</w:t>
-            </w:r>
-          </w:p>
-          <w:p>
-            <w:pPr>
-              <w:spacing w:after="0"/>
-            </w:pPr>
-            <w:r>
-              <w:rPr>
-                <w:rFonts w:ascii="Calibri" w:hAnsi="Calibri"/>
-                <w:sz w:val="21"/>
-              </w:rPr>
-              <w:t>Sign in as Supplier</w:t>
-            </w:r>
-          </w:p>
-        </w:tc>
-        <w:tc>
-          <w:tcPr>
-            <w:tcW w:type="dxa" w:w="4700"/>
-          </w:tcPr>
-          <w:p>
-            <w:pPr>
-              <w:spacing w:after="0"/>
-            </w:pPr>
-            <w:r/>
-            <w:r>
-              <w:rPr>
-                <w:rFonts w:ascii="Calibri" w:hAnsi="Calibri"/>
-                <w:sz w:val="21"/>
-              </w:rPr>
-              <w:t>The portal lists only this supplier's orders</w:t>
-            </w:r>
-          </w:p>
-        </w:tc>
-        <w:tc>
-          <w:tcPr>
-            <w:tcW w:type="dxa" w:w="2100"/>
-          </w:tcPr>
-          <w:p/>
-        </w:tc>
-        <w:tc>
-          <w:tcPr>
-            <w:tcW w:type="dxa" w:w="1520"/>
-          </w:tcPr>
-          <w:p/>
-        </w:tc>
-        <w:tc>
-          <w:tcPr>
-            <w:tcW w:type="dxa" w:w="1100"/>
-          </w:tcPr>
-          <w:p/>
-        </w:tc>
-      </w:tr>
-      <w:tr>
-        <w:tc>
-          <w:tcPr>
-            <w:tcW w:type="dxa" w:w="1900"/>
-            <w:vMerge/>
-          </w:tcPr>
-          <w:p/>
-        </w:tc>
-        <w:tc>
-          <w:tcPr>
-            <w:tcW w:type="dxa" w:w="600"/>
-          </w:tcPr>
-          <w:p/>
-        </w:tc>
-        <w:tc>
-          <w:tcPr>
-            <w:tcW w:type="dxa" w:w="2300"/>
-          </w:tcPr>
-          <w:p/>
-        </w:tc>
-        <w:tc>
-          <w:tcPr>
-            <w:tcW w:type="dxa" w:w="4500"/>
-          </w:tcPr>
-          <w:p>
-            <w:pPr>
-              <w:spacing w:after="0"/>
-            </w:pPr>
-            <w:r/>
-            <w:r>
-              <w:rPr>
-                <w:rFonts w:ascii="Calibri" w:hAnsi="Calibri"/>
-                <w:sz w:val="21"/>
-              </w:rPr>
-              <w:t>Check if only this supplier's products are listed</w:t>
-            </w:r>
-          </w:p>
-          <w:p>
-            <w:pPr>
-              <w:spacing w:after="0"/>
-            </w:pPr>
-            <w:r>
-              <w:rPr>
-                <w:rFonts w:ascii="Calibri" w:hAnsi="Calibri"/>
-                <w:sz w:val="21"/>
-              </w:rPr>
-              <w:t>Look at Products you supply</w:t>
-            </w:r>
-          </w:p>
-        </w:tc>
-        <w:tc>
-          <w:tcPr>
-            <w:tcW w:type="dxa" w:w="4700"/>
-          </w:tcPr>
-          <w:p>
-            <w:pPr>
-              <w:spacing w:after="0"/>
-            </w:pPr>
-            <w:r/>
-            <w:r>
-              <w:rPr>
-                <w:rFonts w:ascii="Calibri" w:hAnsi="Calibri"/>
-                <w:sz w:val="21"/>
-              </w:rPr>
-              <w:t>Only the products the shop buys from this supplier are listed</w:t>
-            </w:r>
-          </w:p>
-        </w:tc>
-        <w:tc>
-          <w:tcPr>
-            <w:tcW w:type="dxa" w:w="2100"/>
-          </w:tcPr>
-          <w:p/>
-        </w:tc>
-        <w:tc>
-          <w:tcPr>
-            <w:tcW w:type="dxa" w:w="1520"/>
-          </w:tcPr>
-          <w:p/>
-        </w:tc>
-        <w:tc>
-          <w:tcPr>
-            <w:tcW w:type="dxa" w:w="1100"/>
-          </w:tcPr>
-          <w:p/>
-        </w:tc>
-      </w:tr>
-      <w:tr>
-        <w:tc>
-          <w:tcPr>
-            <w:tcW w:type="dxa" w:w="1900"/>
-            <w:vMerge/>
-          </w:tcPr>
-          <w:p/>
-        </w:tc>
-        <w:tc>
-          <w:tcPr>
-            <w:tcW w:type="dxa" w:w="600"/>
-          </w:tcPr>
-          <w:p/>
-        </w:tc>
-        <w:tc>
-          <w:tcPr>
-            <w:tcW w:type="dxa" w:w="2300"/>
-          </w:tcPr>
-          <w:p/>
-        </w:tc>
-        <w:tc>
-          <w:tcPr>
-            <w:tcW w:type="dxa" w:w="4500"/>
-          </w:tcPr>
-          <w:p>
-            <w:pPr>
-              <w:spacing w:after="0"/>
-            </w:pPr>
-            <w:r/>
-            <w:r>
-              <w:rPr>
-                <w:rFonts w:ascii="Calibri" w:hAnsi="Calibri"/>
-                <w:sz w:val="21"/>
-              </w:rPr>
-              <w:t>Check if another supplier's order is listed</w:t>
-            </w:r>
-          </w:p>
-          <w:p>
-            <w:pPr>
-              <w:spacing w:after="0"/>
-            </w:pPr>
-            <w:r>
-              <w:rPr>
-                <w:rFonts w:ascii="Calibri" w:hAnsi="Calibri"/>
-                <w:sz w:val="21"/>
-              </w:rPr>
-              <w:t>Look for an order the shop placed with another supplier</w:t>
+              <w:t>Check if another supplier's order is listed: look for an order the shop placed with another supplier</w:t>
             </w:r>
           </w:p>
         </w:tc>
@@ -7271,180 +3413,6 @@
                 <w:sz w:val="21"/>
               </w:rPr>
               <w:t>It is not listed</w:t>
-            </w:r>
-          </w:p>
-        </w:tc>
-        <w:tc>
-          <w:tcPr>
-            <w:tcW w:type="dxa" w:w="2100"/>
-          </w:tcPr>
-          <w:p/>
-        </w:tc>
-        <w:tc>
-          <w:tcPr>
-            <w:tcW w:type="dxa" w:w="1520"/>
-          </w:tcPr>
-          <w:p/>
-        </w:tc>
-        <w:tc>
-          <w:tcPr>
-            <w:tcW w:type="dxa" w:w="1100"/>
-          </w:tcPr>
-          <w:p/>
-        </w:tc>
-      </w:tr>
-      <w:tr>
-        <w:tc>
-          <w:tcPr>
-            <w:tcW w:type="dxa" w:w="1900"/>
-            <w:vMerge/>
-          </w:tcPr>
-          <w:p/>
-        </w:tc>
-        <w:tc>
-          <w:tcPr>
-            <w:tcW w:type="dxa" w:w="600"/>
-          </w:tcPr>
-          <w:p/>
-        </w:tc>
-        <w:tc>
-          <w:tcPr>
-            <w:tcW w:type="dxa" w:w="2300"/>
-          </w:tcPr>
-          <w:p/>
-        </w:tc>
-        <w:tc>
-          <w:tcPr>
-            <w:tcW w:type="dxa" w:w="4500"/>
-          </w:tcPr>
-          <w:p>
-            <w:pPr>
-              <w:spacing w:after="0"/>
-            </w:pPr>
-            <w:r/>
-            <w:r>
-              <w:rPr>
-                <w:rFonts w:ascii="Calibri" w:hAnsi="Calibri"/>
-                <w:sz w:val="21"/>
-              </w:rPr>
-              <w:t>Check if a confirmed order can be confirmed again</w:t>
-            </w:r>
-          </w:p>
-          <w:p>
-            <w:pPr>
-              <w:spacing w:after="0"/>
-            </w:pPr>
-            <w:r>
-              <w:rPr>
-                <w:rFonts w:ascii="Calibri" w:hAnsi="Calibri"/>
-                <w:sz w:val="21"/>
-              </w:rPr>
-              <w:t>Look at an order that is already confirmed</w:t>
-            </w:r>
-          </w:p>
-        </w:tc>
-        <w:tc>
-          <w:tcPr>
-            <w:tcW w:type="dxa" w:w="4700"/>
-          </w:tcPr>
-          <w:p>
-            <w:pPr>
-              <w:spacing w:after="0"/>
-            </w:pPr>
-            <w:r/>
-            <w:r>
-              <w:rPr>
-                <w:rFonts w:ascii="Calibri" w:hAnsi="Calibri"/>
-                <w:sz w:val="21"/>
-              </w:rPr>
-              <w:t>It has no Confirm order button</w:t>
-            </w:r>
-          </w:p>
-        </w:tc>
-        <w:tc>
-          <w:tcPr>
-            <w:tcW w:type="dxa" w:w="2100"/>
-          </w:tcPr>
-          <w:p/>
-        </w:tc>
-        <w:tc>
-          <w:tcPr>
-            <w:tcW w:type="dxa" w:w="1520"/>
-          </w:tcPr>
-          <w:p/>
-        </w:tc>
-        <w:tc>
-          <w:tcPr>
-            <w:tcW w:type="dxa" w:w="1100"/>
-          </w:tcPr>
-          <w:p/>
-        </w:tc>
-      </w:tr>
-      <w:tr>
-        <w:tc>
-          <w:tcPr>
-            <w:tcW w:type="dxa" w:w="1900"/>
-            <w:vMerge/>
-          </w:tcPr>
-          <w:p/>
-        </w:tc>
-        <w:tc>
-          <w:tcPr>
-            <w:tcW w:type="dxa" w:w="600"/>
-          </w:tcPr>
-          <w:p/>
-        </w:tc>
-        <w:tc>
-          <w:tcPr>
-            <w:tcW w:type="dxa" w:w="2300"/>
-          </w:tcPr>
-          <w:p/>
-        </w:tc>
-        <w:tc>
-          <w:tcPr>
-            <w:tcW w:type="dxa" w:w="4500"/>
-          </w:tcPr>
-          <w:p>
-            <w:pPr>
-              <w:spacing w:after="0"/>
-            </w:pPr>
-            <w:r/>
-            <w:r>
-              <w:rPr>
-                <w:rFonts w:ascii="Calibri" w:hAnsi="Calibri"/>
-                <w:sz w:val="21"/>
-              </w:rPr>
-              <w:t>Check if a supplier with no orders is not rated</w:t>
-            </w:r>
-          </w:p>
-          <w:p>
-            <w:pPr>
-              <w:spacing w:after="0"/>
-            </w:pPr>
-            <w:r>
-              <w:rPr>
-                <w:rFonts w:ascii="Calibri" w:hAnsi="Calibri"/>
-                <w:sz w:val="21"/>
-              </w:rPr>
-              <w:t>Open the portal when no order was received in the last 12 months</w:t>
-            </w:r>
-          </w:p>
-        </w:tc>
-        <w:tc>
-          <w:tcPr>
-            <w:tcW w:type="dxa" w:w="4700"/>
-          </w:tcPr>
-          <w:p>
-            <w:pPr>
-              <w:spacing w:after="0"/>
-            </w:pPr>
-            <w:r/>
-            <w:r>
-              <w:rPr>
-                <w:rFonts w:ascii="Calibri" w:hAnsi="Calibri"/>
-                <w:sz w:val="21"/>
-              </w:rPr>
-              <w:t>A message "Not rated yet: no order from this supplier was received in the last 12 months." is displayed</w:t>
             </w:r>
           </w:p>
         </w:tc>
@@ -7584,19 +3552,7 @@
                 <w:rFonts w:ascii="Calibri" w:hAnsi="Calibri"/>
                 <w:sz w:val="21"/>
               </w:rPr>
-              <w:t>Check if the contact details are saved</w:t>
-            </w:r>
-          </w:p>
-          <w:p>
-            <w:pPr>
-              <w:spacing w:after="0"/>
-            </w:pPr>
-            <w:r>
-              <w:rPr>
-                <w:rFonts w:ascii="Calibri" w:hAnsi="Calibri"/>
-                <w:sz w:val="21"/>
-              </w:rPr>
-              <w:t>Click Edit contact details, change them, then click Save details</w:t>
+              <w:t>Check if the contact details are saved: click Edit contact details, change them, then click Save details</w:t>
             </w:r>
           </w:p>
         </w:tc>
@@ -7615,93 +3571,6 @@
                 <w:sz w:val="21"/>
               </w:rPr>
               <w:t>A message "Your details were updated." is displayed</w:t>
-            </w:r>
-          </w:p>
-        </w:tc>
-        <w:tc>
-          <w:tcPr>
-            <w:tcW w:type="dxa" w:w="2100"/>
-          </w:tcPr>
-          <w:p/>
-        </w:tc>
-        <w:tc>
-          <w:tcPr>
-            <w:tcW w:type="dxa" w:w="1520"/>
-          </w:tcPr>
-          <w:p/>
-        </w:tc>
-        <w:tc>
-          <w:tcPr>
-            <w:tcW w:type="dxa" w:w="1100"/>
-          </w:tcPr>
-          <w:p/>
-        </w:tc>
-      </w:tr>
-      <w:tr>
-        <w:tc>
-          <w:tcPr>
-            <w:tcW w:type="dxa" w:w="1900"/>
-            <w:vMerge/>
-          </w:tcPr>
-          <w:p/>
-        </w:tc>
-        <w:tc>
-          <w:tcPr>
-            <w:tcW w:type="dxa" w:w="600"/>
-          </w:tcPr>
-          <w:p/>
-        </w:tc>
-        <w:tc>
-          <w:tcPr>
-            <w:tcW w:type="dxa" w:w="2300"/>
-          </w:tcPr>
-          <w:p/>
-        </w:tc>
-        <w:tc>
-          <w:tcPr>
-            <w:tcW w:type="dxa" w:w="4500"/>
-          </w:tcPr>
-          <w:p>
-            <w:pPr>
-              <w:spacing w:after="0"/>
-            </w:pPr>
-            <w:r/>
-            <w:r>
-              <w:rPr>
-                <w:rFonts w:ascii="Calibri" w:hAnsi="Calibri"/>
-                <w:sz w:val="21"/>
-              </w:rPr>
-              <w:t>Check if the price is the current one</w:t>
-            </w:r>
-          </w:p>
-          <w:p>
-            <w:pPr>
-              <w:spacing w:after="0"/>
-            </w:pPr>
-            <w:r>
-              <w:rPr>
-                <w:rFonts w:ascii="Calibri" w:hAnsi="Calibri"/>
-                <w:sz w:val="21"/>
-              </w:rPr>
-              <w:t>Click Change price and enter the current price</w:t>
-            </w:r>
-          </w:p>
-        </w:tc>
-        <w:tc>
-          <w:tcPr>
-            <w:tcW w:type="dxa" w:w="4700"/>
-          </w:tcPr>
-          <w:p>
-            <w:pPr>
-              <w:spacing w:after="0"/>
-            </w:pPr>
-            <w:r/>
-            <w:r>
-              <w:rPr>
-                <w:rFonts w:ascii="Calibri" w:hAnsi="Calibri"/>
-                <w:sz w:val="21"/>
-              </w:rPr>
-              <w:t>A message "That is already the current price." is displayed</w:t>
             </w:r>
           </w:p>
         </w:tc>
@@ -7841,19 +3710,7 @@
                 <w:rFonts w:ascii="Calibri" w:hAnsi="Calibri"/>
                 <w:sz w:val="21"/>
               </w:rPr>
-              <w:t>Check if the stars match the shop's</w:t>
-            </w:r>
-          </w:p>
-          <w:p>
-            <w:pPr>
-              <w:spacing w:after="0"/>
-            </w:pPr>
-            <w:r>
-              <w:rPr>
-                <w:rFonts w:ascii="Calibri" w:hAnsi="Calibri"/>
-                <w:sz w:val="21"/>
-              </w:rPr>
-              <w:t>Look at the star rating on the portal</w:t>
+              <w:t>Check if the stars match the shop's: look at the star rating on the portal</w:t>
             </w:r>
           </w:p>
         </w:tc>
@@ -7928,19 +3785,7 @@
                 <w:rFonts w:ascii="Calibri" w:hAnsi="Calibri"/>
                 <w:sz w:val="21"/>
               </w:rPr>
-              <w:t>Check if a price proposal reaches the shop</w:t>
-            </w:r>
-          </w:p>
-          <w:p>
-            <w:pPr>
-              <w:spacing w:after="0"/>
-            </w:pPr>
-            <w:r>
-              <w:rPr>
-                <w:rFonts w:ascii="Calibri" w:hAnsi="Calibri"/>
-                <w:sz w:val="21"/>
-              </w:rPr>
-              <w:t>Click Change price and enter a price different from the current one</w:t>
+              <w:t>Check if a price proposal reaches the shop: click Change price and enter a price different from the current one</w:t>
             </w:r>
           </w:p>
         </w:tc>

</xml_diff>